<commit_message>
A Menina Elefante: correções da família (ordem e datas das filhas, "Yoshi", Kousuke desde os 16)
- Ayumi (20/05/2014) é a mais velha, Mity (17/05/2016) a do meio, Tiemi
  (14/10/2022) a caçula: caps. 16-18, 20, 22, 24, 25 e 30 ajustados; a
  gravidez da Tiemi passa a ser descoberta em março de 2022.
- A Nair chama o marido de Yoshi (caps. 1, 2 e 13).
- As flanelas saem: o Kousuke aparece no cap. 5 e o cap. 10 conta os
  quatro anos de visitas e trabalhos de escola; ecos nos caps. 21, 31 e 33.
- Bíblia, decisões, roteiro e .docx atualizados.

Co-Authored-By: Claude Opus 5.5 <noreply@anthropic.com>
Claude-Session: https://claude.ai/code/session_011ZTeK22H8KBNtWenzEUTZE
</commit_message>
<xml_diff>
--- a/menina_elefante/saidas/A_Menina_Elefante_V3.docx
+++ b/menina_elefante/saidas/A_Menina_Elefante_V3.docx
@@ -379,7 +379,7 @@
     </w:p>
     <w:p>
       <w:r>
-        <w:t xml:space="preserve">— Yoshinori, vai assistir tua televisão.</w:t>
+        <w:t xml:space="preserve">— Yoshi, vai assistir tua televisão.</w:t>
       </w:r>
     </w:p>
     <w:p>
@@ -404,7 +404,7 @@
     </w:p>
     <w:p>
       <w:r>
-        <w:t xml:space="preserve">— Yoshinori!</w:t>
+        <w:t xml:space="preserve">— Yoshi!</w:t>
       </w:r>
     </w:p>
     <w:p>
@@ -1010,7 +1010,7 @@
     </w:p>
     <w:p>
       <w:r>
-        <w:t xml:space="preserve">— Yoshinori! — Minha mãe apareceu na porta da cozinha, com um pano de prato no ombro. — Não fala uma coisa dessas.</w:t>
+        <w:t xml:space="preserve">— Yoshi! — Minha mãe apareceu na porta da cozinha, com um pano de prato no ombro. — Não fala uma coisa dessas.</w:t>
       </w:r>
     </w:p>
     <w:p>
@@ -2434,6 +2434,36 @@
     </w:p>
     <w:p>
       <w:r>
+        <w:t xml:space="preserve">Nas terças e quintas, quem aparecia lá em casa era o Kousuke. Ele tinha dezesseis anos, dois a mais do que eu, era filho de uma família que a minha mãe conhecia da associação, e desde o começo do ano tocava a campainha com uma desculpa diferente: a maquete de geografia, a lista de física, um livro que ele jurava que eu ia precisar. Sentava na mesa da cozinha, abria o caderno e ficava. Minha mãe deixava a porta da sala aberta e passava por ali mais vezes do que precisava.</w:t>
+      </w:r>
+    </w:p>
+    <w:p>
+      <w:r>
+        <w:t xml:space="preserve">Na primeira terça, ele viu a Carla na mesa e não perguntou nada. Puxou uma cadeira do outro lado, abriu o meu livro de química e explicou balanceamento de equação para as duas, devagar, desenhando bolinhas no canto da folha. A Carla, que não falava com ninguém fazia dias, perguntou a ele por que o oxigênio vinha sempre em dupla. Ele explicou de novo, com mais bolinhas.</w:t>
+      </w:r>
+    </w:p>
+    <w:p>
+      <w:r>
+        <w:t xml:space="preserve">Quando o portão bateu, ela falou sem tirar os olhos do caderno:</w:t>
+      </w:r>
+    </w:p>
+    <w:p>
+      <w:r>
+        <w:t xml:space="preserve">— Ele vem por causa da química?</w:t>
+      </w:r>
+    </w:p>
+    <w:p>
+      <w:r>
+        <w:t xml:space="preserve">— Vem.</w:t>
+      </w:r>
+    </w:p>
+    <w:p>
+      <w:r>
+        <w:t xml:space="preserve">— Sei.</w:t>
+      </w:r>
+    </w:p>
+    <w:p>
+      <w:r>
         <w:t xml:space="preserve">Quem conseguiu fazer a Carla rir foi meu pai.</w:t>
       </w:r>
     </w:p>
@@ -4853,60 +4883,60 @@
         <w:rPr>
           <w:smallCaps/>
         </w:rPr>
-        <w:t xml:space="preserve">O Kousuke comprou flanela</w:t>
-      </w:r>
-      <w:r>
-        <w:t xml:space="preserve"> de limpar lente na ótica onze vezes antes de eu aceitar sair com ele.</w:t>
-      </w:r>
-    </w:p>
-    <w:p>
-      <w:r>
-        <w:t xml:space="preserve">Foi minha mãe que reparou primeiro, numa quarta-feira, quando ele saiu pela porta de vidro com mais um saquinho de plástico na mão.</w:t>
-      </w:r>
-    </w:p>
-    <w:p>
-      <w:r>
-        <w:t xml:space="preserve">— Esse menino tem quantos óculos?</w:t>
-      </w:r>
-    </w:p>
-    <w:p>
-      <w:r>
-        <w:t xml:space="preserve">— Um, eu acho.</w:t>
-      </w:r>
-    </w:p>
-    <w:p>
-      <w:r>
-        <w:t xml:space="preserve">— E precisa de tanta flanela?</w:t>
-      </w:r>
-    </w:p>
-    <w:p>
-      <w:r>
-        <w:t xml:space="preserve">Eu conhecia o Kousuke de vista havia anos, do jeito que todo descendente conhecia todo descendente naquela cidade: de festa da associação, de ser apresentado três vezes à mesma pessoa por três tias diferentes. Ele era um pouco mais velho, usava óculos de armação preta que tinha comprado ali, com o meu pai, e falava de um jeito complicado demais para a idade dele. Uma vez, esperando o troco, me explicou por que o preço da lente tinha subido, com câmbio e importação, e eu fiquei olhando para ele sem entender como alguém conseguia pensar tanto sobre uma lente.</w:t>
-      </w:r>
-    </w:p>
-    <w:p>
-      <w:r>
-        <w:t xml:space="preserve">Ele me convidou para sair na terceira flanela. Eu disse que não podia. Na quinta, disse que estava estudando. Na oitava, disse que meu pai estava doente, o que era verdade. Na décima, não disse nada, só sorri e entreguei o troco.</w:t>
-      </w:r>
-    </w:p>
-    <w:p>
-      <w:r>
-        <w:t xml:space="preserve">— Você vai continuar dizendo não até quando? — perguntou ele, na décima primeira.</w:t>
-      </w:r>
-    </w:p>
-    <w:p>
-      <w:r>
-        <w:t xml:space="preserve">— Até você parar de comprar flanela.</w:t>
-      </w:r>
-    </w:p>
-    <w:p>
-      <w:r>
-        <w:t xml:space="preserve">— Eu já tenho flanela para limpar óculos até os sessenta anos.</w:t>
-      </w:r>
-    </w:p>
-    <w:p>
-      <w:r>
-        <w:t xml:space="preserve">Minha mãe, na salinha de exame, riu alto. Eu fiquei vermelha até a orelha e disse que tudo bem, sábado, mas só um lanche, e não podia ser tarde.</w:t>
+        <w:t xml:space="preserve">O Kousuke tentava namorar</w:t>
+      </w:r>
+      <w:r>
+        <w:t xml:space="preserve"> comigo desde os dezesseis anos.</w:t>
+      </w:r>
+    </w:p>
+    <w:p>
+      <w:r>
+        <w:t xml:space="preserve">Começou com a maquete de geografia e não parou mais. Durante quatro anos, ele tocou a campainha lá de casa com uma desculpa diferente: a lista de física, o trabalho de história de um grupo do qual ele não fazia parte, o livro que eu ia precisar no vestibular, a apostila de um cursinho que ele já tinha terminado. Sentava na mesa da cozinha, abria o caderno e ficava. Ficava depois do trabalho pronto, depois do café, depois de a minha mãe passar pela sala pela terceira vez com o pano de prato no ombro.</w:t>
+      </w:r>
+    </w:p>
+    <w:p>
+      <w:r>
+        <w:t xml:space="preserve">— Esse menino vem estudar ou vem te ver? — ela perguntou uma noite, quando o portão bateu.</w:t>
+      </w:r>
+    </w:p>
+    <w:p>
+      <w:r>
+        <w:t xml:space="preserve">— Estudar.</w:t>
+      </w:r>
+    </w:p>
+    <w:p>
+      <w:r>
+        <w:t xml:space="preserve">— Ele já terminou a escola, filha.</w:t>
+      </w:r>
+    </w:p>
+    <w:p>
+      <w:r>
+        <w:t xml:space="preserve">Eu conhecia o Kousuke do jeito que todo descendente conhecia todo descendente naquela cidade: de festa da associação, de ser apresentado três vezes à mesma pessoa por três tias diferentes. Ele usava óculos de armação preta e falava de um jeito complicado demais para a idade dele. Uma vez, no meio de um exercício de matemática, me explicou por que o preço do arroz tinha subido, com câmbio e importação, e eu fiquei olhando para ele sem entender como alguém conseguia pensar tanto sobre arroz.</w:t>
+      </w:r>
+    </w:p>
+    <w:p>
+      <w:r>
+        <w:t xml:space="preserve">Ele me convidou para sair a primeira vez na porta de casa, com a maquete ainda úmida de cola nas mãos. Eu disse que não podia. No ano seguinte, disse que estava estudando. Depois do infarto, disse que o meu pai estava doente, o que era verdade, e ele continuou vindo, e passou a ajudar a carregar as sacolas da farmácia sem que ninguém pedisse.</w:t>
+      </w:r>
+    </w:p>
+    <w:p>
+      <w:r>
+        <w:t xml:space="preserve">— Você vai continuar dizendo não até quando? — perguntou ele, numa tarde, na mesa da cozinha, com a minha apostila da faculdade aberta entre nós.</w:t>
+      </w:r>
+    </w:p>
+    <w:p>
+      <w:r>
+        <w:t xml:space="preserve">— Até você parar de vir.</w:t>
+      </w:r>
+    </w:p>
+    <w:p>
+      <w:r>
+        <w:t xml:space="preserve">— Eu não vou parar de vir.</w:t>
+      </w:r>
+    </w:p>
+    <w:p>
+      <w:r>
+        <w:t xml:space="preserve">Minha mãe, no fogão, riu alto. Eu fiquei vermelha até a orelha e disse que tudo bem, sábado, mas só um lanche, e não podia ser tarde.</w:t>
       </w:r>
     </w:p>
     <w:p>
@@ -5330,7 +5360,7 @@
           <w:sz w:val="22"/>
           <w:szCs w:val="22"/>
         </w:rPr>
-        <w:t xml:space="preserve">Por isso o Kousuke me assustou tanto. Ele não precisava de nada, e continuava voltando. Onze flanelas, seis quadras, dez passos atrás. Cada gentileza dele me deixava esperando a conta chegar, porque, na minha cabeça, ninguém fica perto de graça.</w:t>
+        <w:t xml:space="preserve">Por isso o Kousuke me assustou tanto. Ele não precisava de nada, e continuava voltando. Quatro anos de trabalhos de escola, seis quadras, dez passos atrás. Cada gentileza dele me deixava esperando a conta chegar, porque, na minha cabeça, ninguém fica perto de graça.</w:t>
       </w:r>
     </w:p>
     <w:p>
@@ -6319,7 +6349,7 @@
     </w:p>
     <w:p>
       <w:r>
-        <w:t xml:space="preserve">Minha mãe cumprimentou meu pai com um "oi, Yoshinori" e sentou do outro lado. Meu pai respondeu "oi, Nair". Foi tudo. Todos na mesa fingiram não ter prestado atenção, com a eficiência de quem tem prática em almoço de família.</w:t>
+        <w:t xml:space="preserve">Minha mãe cumprimentou meu pai com um "oi, Yoshi", o apelido de sempre, e sentou do outro lado. Meu pai respondeu "oi, Nair". Foi tudo. Todos na mesa fingiram não ter prestado atenção, com a eficiência de quem tem prática em almoço de família.</w:t>
       </w:r>
     </w:p>
     <w:p>
@@ -7865,7 +7895,7 @@
         <w:ind w:firstLine="0"/>
       </w:pPr>
       <w:r>
-        <w:t xml:space="preserve">A Mity nasceu no ano seguinte.</w:t>
+        <w:t xml:space="preserve">A Ayumi nasceu no ano seguinte, numa madrugada de maio.</w:t>
       </w:r>
     </w:p>
     <w:p>
@@ -7987,7 +8017,7 @@
           <w:sz w:val="22"/>
           <w:szCs w:val="22"/>
         </w:rPr>
-        <w:t xml:space="preserve">Aí a Mity nasceu, e nenhum caderno deu conta dela. Quando a minha primeira filha nasceu, nasceu também a minha identidade de mãe, e eu não sabia o que fazer com ela. Estava habilitada e não sabia fazer a baliza. A prática precisou me ensinar o que o documento dizia que eu já podia fazer.</w:t>
+        <w:t xml:space="preserve">Aí a Ayumi nasceu, e nenhum caderno deu conta dela. Quando a minha primeira filha nasceu, nasceu também a minha identidade de mãe, e eu não sabia o que fazer com ela. Estava habilitada e não sabia fazer a baliza. A prática precisou me ensinar o que o documento dizia que eu já podia fazer.</w:t>
       </w:r>
     </w:p>
     <w:p>
@@ -8051,7 +8081,7 @@
           <w:sz w:val="19"/>
           <w:szCs w:val="19"/>
         </w:rPr>
-        <w:t xml:space="preserve">CAPÍTULO 17 · 2014–2015</w:t>
+        <w:t xml:space="preserve">CAPÍTULO 17 · 2014–2016</w:t>
       </w:r>
     </w:p>
     <w:p>
@@ -8082,7 +8112,7 @@
         <w:t xml:space="preserve">Todo mundo sabia como</w:t>
       </w:r>
       <w:r>
-        <w:t xml:space="preserve"> a Mity devia dormir.</w:t>
+        <w:t xml:space="preserve"> a Ayumi devia dormir.</w:t>
       </w:r>
     </w:p>
     <w:p>
@@ -8146,7 +8176,7 @@
     </w:p>
     <w:p>
       <w:r>
-        <w:t xml:space="preserve">Era uma senhora simpática, de cabelo branco curto, que vinha trocar a lente de ano em ano e sempre trazia uma caixinha de doce para a minha mãe. Numa tarde, o Kousuke passou para me buscar com a Mity no colo, e a senhora viu ele pela porta de vidro, de camisa, com a menina dormindo no ombro, trazendo a bolsa de fraldas e o meu guarda-chuva. Ela ficou olhando. Depois se virou para mim com o rosto todo derretido.</w:t>
+        <w:t xml:space="preserve">Era uma senhora simpática, de cabelo branco curto, que vinha trocar a lente de ano em ano e sempre trazia uma caixinha de doce para a minha mãe. Numa tarde, o Kousuke passou para me buscar com a Ayumi no colo, e a senhora viu ele pela porta de vidro, de camisa, com a menina dormindo no ombro, trazendo a bolsa de fraldas e o meu guarda-chuva. Ela ficou olhando. Depois se virou para mim com o rosto todo derretido.</w:t>
       </w:r>
     </w:p>
     <w:p>
@@ -8161,7 +8191,7 @@
     </w:p>
     <w:p>
       <w:r>
-        <w:t xml:space="preserve">À noite, dando banho na Mity, a frase voltou. Você tem sorte. Sorte. Como quem ganha na rifa uma coisa que não merecia, como quem acha dinheiro na rua. Ninguém dizia que o Kousuke tinha sorte de ter a mim. Ninguém dizia, e eu concordava com ninguém.</w:t>
+        <w:t xml:space="preserve">À noite, dando banho na Ayumi, a frase voltou. Você tem sorte. Sorte. Como quem ganha na rifa uma coisa que não merecia, como quem acha dinheiro na rua. Ninguém dizia que o Kousuke tinha sorte de ter a mim. Ninguém dizia, e eu concordava com ninguém.</w:t>
       </w:r>
     </w:p>
     <w:p>
@@ -8305,12 +8335,12 @@
         <w:ind w:firstLine="0"/>
       </w:pPr>
       <w:r>
-        <w:t xml:space="preserve">A Ayumi veio logo depois, tão logo que a Mity ainda não tinha largado a mamadeira.</w:t>
-      </w:r>
-    </w:p>
-    <w:p>
-      <w:r>
-        <w:t xml:space="preserve">Na segunda gravidez eu briguei mais. Brigava com o Kousuke por causa da louça, do horário, da mãe dele, da minha mãe, do jeito como ele segurava a Mity, do jeito como ele não segurava. Brigava e depois não lembrava direito por quê. Criava situações, como no tempo do recado de estatística, só que agora com barriga. Testava para ver se ele ia embora. Ele não ia.</w:t>
+        <w:t xml:space="preserve">A Mity veio dois anos depois, também em maio, quando a Ayumi ainda não tinha largado a mamadeira.</w:t>
+      </w:r>
+    </w:p>
+    <w:p>
+      <w:r>
+        <w:t xml:space="preserve">Na segunda gravidez eu briguei mais. Brigava com o Kousuke por causa da louça, do horário, da mãe dele, da minha mãe, do jeito como ele segurava a Ayumi, do jeito como ele não segurava. Brigava e depois não lembrava direito por quê. Criava situações, como no tempo do recado de estatística, só que agora com barriga. Testava para ver se ele ia embora. Ele não ia.</w:t>
       </w:r>
     </w:p>
     <w:p>
@@ -8325,7 +8355,7 @@
     </w:p>
     <w:p>
       <w:r>
-        <w:t xml:space="preserve">Na manhã da viagem, quando desci com a Mity no colo, o banco de trás do carro estava diferente. O Kousuke tinha tirado a cadeirinha da Mity e posto na frente. Tinha dobrado o encosto e forrado tudo com o edredom da nossa cama, dois travesseiros e uma almofada de amamentação por cima, e ainda uma toalha enrolada no lugar exato onde iam ficar os meus tornozelos.</w:t>
+        <w:t xml:space="preserve">Na manhã da viagem, quando desci com a Ayumi no colo, o banco de trás do carro estava diferente. O Kousuke tinha tirado a cadeirinha da Ayumi e posto na frente. Tinha dobrado o encosto e forrado tudo com o edredom da nossa cama, dois travesseiros e uma almofada de amamentação por cima, e ainda uma toalha enrolada no lugar exato onde iam ficar os meus tornozelos.</w:t>
       </w:r>
     </w:p>
     <w:p>
@@ -8340,7 +8370,7 @@
     </w:p>
     <w:p>
       <w:r>
-        <w:t xml:space="preserve">Eu não lembro nada daquele casamento. Não lembro da noiva, do vestido, da festa. Lembro das quatro horas deitada no banco de trás, com os pés na toalha enrolada, olhando o céu passar pela janela de cabeça para baixo, e da Mity dormindo na cadeirinha da frente, e da nuca dele dirigindo.</w:t>
+        <w:t xml:space="preserve">Eu não lembro nada daquele casamento. Não lembro da noiva, do vestido, da festa. Lembro das quatro horas deitada no banco de trás, com os pés na toalha enrolada, olhando o céu passar pela janela de cabeça para baixo, e da Ayumi dormindo na cadeirinha da frente, e da nuca dele dirigindo.</w:t>
       </w:r>
     </w:p>
     <w:p>
@@ -8359,12 +8389,12 @@
         <w:ind w:firstLine="0"/>
       </w:pPr>
       <w:r>
-        <w:t xml:space="preserve">Naquela mesma semana, numa noite em que a casa estava quieta e a Mity e o Kousuke dormiam, eu me olhei no espelho do banheiro.</w:t>
-      </w:r>
-    </w:p>
-    <w:p>
-      <w:r>
-        <w:t xml:space="preserve">Eu estava de camisola, com a barriga enorme, o cabelo preso de qualquer jeito, as olheiras de quem não dormia desde a Mity. Fiquei um tempo olhando para aquela mulher, procurando o que as pessoas viam. A que não falava japonês fluente. A que não tinha passado em concurso. A que não tinha clínica.</w:t>
+        <w:t xml:space="preserve">Naquela mesma semana, numa noite em que a casa estava quieta e a Ayumi e o Kousuke dormiam, eu me olhei no espelho do banheiro.</w:t>
+      </w:r>
+    </w:p>
+    <w:p>
+      <w:r>
+        <w:t xml:space="preserve">Eu estava de camisola, com a barriga enorme, o cabelo preso de qualquer jeito, as olheiras de quem não dormia desde a Ayumi. Fiquei um tempo olhando para aquela mulher, procurando o que as pessoas viam. A que não falava japonês fluente. A que não tinha passado em concurso. A que não tinha clínica.</w:t>
       </w:r>
     </w:p>
     <w:p>
@@ -8575,7 +8605,7 @@
     </w:p>
     <w:p>
       <w:r>
-        <w:t xml:space="preserve">Não houve um motivo. Houve um acúmulo. Naquela manhã, uma tia tinha comentado no grupo da família que a filha de alguém tinha comprado um apartamento à vista. Na ótica, minha mãe tinha corrigido, na frente de um cliente, um número que eu tinha anotado errado. No caixa do supermercado, a moça tinha olhado as duas meninas e perguntado se eram gêmeas, e quando eu disse que não, tinha dito "nossa, que coragem, duas assim tão seguidinhas". Coisas pequenas. Cada uma do tamanho de uma letra da última linha da tabela.</w:t>
+        <w:t xml:space="preserve">Não houve um motivo. Houve um acúmulo. Naquela manhã, uma tia tinha comentado no grupo da família que a filha de alguém tinha comprado um apartamento à vista. Na ótica, minha mãe tinha corrigido, na frente de um cliente, um número que eu tinha anotado errado. No caixa do supermercado, a moça tinha olhado as duas meninas e perguntado quantos anos cada uma tinha, e quando eu disse, tinha feito a conta nos dedos e dito "nossa, que coragem, duas assim tão seguidinhas". Coisas pequenas. Cada uma do tamanho de uma letra da última linha da tabela.</w:t>
       </w:r>
     </w:p>
     <w:p>
@@ -8776,7 +8806,7 @@
         <w:ind w:firstLine="0"/>
       </w:pPr>
       <w:r>
-        <w:t xml:space="preserve">Voltamos com as duas pequenas, a Mity com uns três anos, a Ayumi com dois, cada uma com a sua mochilinha de rodinhas cheia de brinquedo que não podia ser despachado.</w:t>
+        <w:t xml:space="preserve">Voltamos com as duas pequenas, a Ayumi com três anos, puxando uma mochilinha de rodinhas cheia de brinquedo que não podia ser despachado, e a Mity com um ano, no colo, puxando o meu cabelo.</w:t>
       </w:r>
     </w:p>
     <w:p>
@@ -8889,7 +8919,7 @@
     </w:p>
     <w:p>
       <w:r>
-        <w:t xml:space="preserve">Eu estava do lado de fora do portão de desembarque desde uma hora antes, com as duas meninas pela mão, a Mity segurando uma folha de papel onde tinha escrito VOVÓ com canetinha, cada letra de uma cor. As portas automáticas abriam e fechavam, abriam e fechavam, soltando gente de outros voos, executivos, turistas, uma família inteira de chapéu.</w:t>
+        <w:t xml:space="preserve">Eu estava do lado de fora do portão de desembarque desde uma hora antes, com as duas meninas pela mão, a Ayumi segurando uma folha de papel onde tinha escrito VOVÓ com canetinha, cada letra de uma cor. As portas automáticas abriam e fechavam, abriam e fechavam, soltando gente de outros voos, executivos, turistas, uma família inteira de chapéu.</w:t>
       </w:r>
     </w:p>
     <w:p>
@@ -9927,7 +9957,7 @@
     </w:p>
     <w:p>
       <w:r>
-        <w:t xml:space="preserve">Eu pus as mãos no volante, olhei um ponto fixo no para-brisa, uma sujeirinha qualquer, e comecei a contar baixinho, como alguém um dia me ensinou para momentos assim. Um. Dois. Três. Pelo retrovisor, vi a Mity segurar a mão da Ayumi.</w:t>
+        <w:t xml:space="preserve">Eu pus as mãos no volante, olhei um ponto fixo no para-brisa, uma sujeirinha qualquer, e comecei a contar baixinho, como alguém um dia me ensinou para momentos assim. Um. Dois. Três. Pelo retrovisor, vi a Ayumi segurar a mão da Mity.</w:t>
       </w:r>
     </w:p>
     <w:p>
@@ -10123,7 +10153,7 @@
           <w:sz w:val="22"/>
           <w:szCs w:val="22"/>
         </w:rPr>
-        <w:t xml:space="preserve">2020–2023</w:t>
+        <w:t xml:space="preserve">2020–2022</w:t>
       </w:r>
     </w:p>
     <w:p>
@@ -10290,7 +10320,7 @@
     </w:p>
     <w:p>
       <w:r>
-        <w:t xml:space="preserve">Ele entendia de investimento. Sempre tinha entendido; lia sobre isso desde o tempo da flanela, falava de juros compostos em pedido de casamento. Nas noites de sexta, depois da planilha da casa, ficava vendo vídeos sobre bolsa, sobre fundos, sobre como os brasileiros no Japão deixavam o dinheiro parado no banco sem render nada. Eu olhei para aquilo e vi um curso.</w:t>
+        <w:t xml:space="preserve">Ele entendia de investimento. Sempre tinha entendido; lia sobre isso desde o tempo da maquete de geografia, falava de juros compostos em pedido de casamento. Nas noites de sexta, depois da planilha da casa, ficava vendo vídeos sobre bolsa, sobre fundos, sobre como os brasileiros no Japão deixavam o dinheiro parado no banco sem render nada. Eu olhei para aquilo e vi um curso.</w:t>
       </w:r>
     </w:p>
     <w:p>
@@ -10828,7 +10858,7 @@
     </w:p>
     <w:p>
       <w:r>
-        <w:t xml:space="preserve">Eu estava de chapéu de palha, máscara, calça branca, puxando uma mala de rodinha cor-de-rosa-choque que a Ayumi tinha escolhido, e a Mity segurava o cartão de embarque das duas como se fosse um documento de Estado. No saguão, enquanto a gente esperava, eu olhei pela janela os aviões parados e pensei que um avião precisa usar toda a força do motor para sair do chão. Depois que sobe, fica mais fácil. Pensei isso e fiquei com vergonha de ter pensado uma coisa tão bonita, e não disse para ninguém.</w:t>
+        <w:t xml:space="preserve">Eu estava de chapéu de palha, máscara, calça branca, puxando uma mala de rodinha cor-de-rosa-choque que a Mity tinha escolhido, e a Ayumi segurava o cartão de embarque das duas como se fosse um documento de Estado. No saguão, enquanto a gente esperava, eu olhei pela janela os aviões parados e pensei que um avião precisa usar toda a força do motor para sair do chão. Depois que sobe, fica mais fácil. Pensei isso e fiquei com vergonha de ter pensado uma coisa tão bonita, e não disse para ninguém.</w:t>
       </w:r>
     </w:p>
     <w:p>
@@ -11812,7 +11842,7 @@
           <w:sz w:val="19"/>
           <w:szCs w:val="19"/>
         </w:rPr>
-        <w:t xml:space="preserve">CAPÍTULO 24 · 2022–2023</w:t>
+        <w:t xml:space="preserve">CAPÍTULO 24 · 2022</w:t>
       </w:r>
     </w:p>
     <w:p>
@@ -11911,17 +11941,27 @@
         <w:ind w:firstLine="0"/>
       </w:pPr>
       <w:r>
-        <w:t xml:space="preserve">A primeira venda levou quase três meses.</w:t>
-      </w:r>
-    </w:p>
-    <w:p>
-      <w:r>
-        <w:t xml:space="preserve">Era um casal jovem, ele de fábrica de autopeças, ela de fábrica de bentō, com um bebê de colo e uma pasta de documentos mais bagunçada do que qualquer uma que eu tinha visto na ótica. A gente passou noites organizando aquela pasta na mesa da nossa cozinha, cada papel no seu plástico, com etiqueta escrita à mão. O primeiro banco recusou. O segundo também. O terceiro aprovou. Quando o Kousuke me mostrou a mensagem do banco no celular, eu estava lavando louça, e fiquei com as mãos cheias de espuma, sem conseguir pegar o celular, olhando a tela por cima do ombro dele, lendo a palavra em japonês que eu tinha aprendido a reconhecer de tanto esperar por ela.</w:t>
-      </w:r>
-    </w:p>
-    <w:p>
-      <w:r>
-        <w:t xml:space="preserve">Depois vieram outras. Uma a cada dois ou três meses. Depois uma por mês. Depois, sem que a gente soubesse direito como, duas, três casas no mesmo mês.</w:t>
+        <w:t xml:space="preserve">Três semanas depois de voltar, com as malas ainda abertas no corredor, eu descobri que estava grávida da terceira. Pelas contas da médica, ela tinha vindo com a gente do Brasil. Tinha atravessado a COVID na Bahia e a noite no aeroporto da Alemanha sem que ninguém soubesse, nem eu.</w:t>
+      </w:r>
+    </w:p>
+    <w:p>
+      <w:r>
+        <w:t xml:space="preserve">Eu sempre tinha dito que queria uma família grande, com aqueles natais cheios de gente, mesa comprida, como os almoços de ano-novo da família da minha mãe. Tinha dito isso a vida inteira. E, quando vi as duas listras de novo no palitinho de plástico, sentada no chão do banheiro do apartamento japonês, a primeira coisa que eu senti foi pânico.</w:t>
+      </w:r>
+    </w:p>
+    <w:p>
+      <w:r>
+        <w:t xml:space="preserve">O bebê eu queria. O pânico vinha das vozes. Eu já as ouvia, antes de contar para qualquer um. Três? Agora? Com a empresa começando? No Japão, longe de todo mundo? Vocês não têm juízo? Eu ouvia cada frase com a voz de uma tia diferente, de uma cliente diferente, de uma vizinha diferente, e as frases estavam tão bem ensaiadas dentro de mim que eu nem precisava que ninguém as dissesse.</w:t>
+      </w:r>
+    </w:p>
+    <w:p>
+      <w:r>
+        <w:t xml:space="preserve">Naquela noite, sem conseguir dormir, eu abri no celular a pasta de fotos antigas e procurei, sem saber por quê, a foto da ponte. A do bungee de cinquenta metros, um ano e pouco antes. Eu, de capacete, lá em cima, na beira da plataforma, com um sorriso esticado e as mãos agarradas ao arnês. Fiquei olhando aquela foto por muito tempo. Os medos eram diferentes. Mas eram iguais. Medo era medo.</w:t>
+      </w:r>
+    </w:p>
+    <w:p>
+      <w:r>
+        <w:t xml:space="preserve">Contei ao Kousuke de manhã. Ele não fez planilha.</w:t>
       </w:r>
     </w:p>
     <w:p>
@@ -11940,27 +11980,17 @@
         <w:ind w:firstLine="0"/>
       </w:pPr>
       <w:r>
-        <w:t xml:space="preserve">Foi no meio disso, num outono, que eu descobri que estava grávida da terceira.</w:t>
-      </w:r>
-    </w:p>
-    <w:p>
-      <w:r>
-        <w:t xml:space="preserve">Eu sempre tinha dito que queria uma família grande, com aqueles natais cheios de gente, mesa comprida, como os almoços de ano-novo da família da minha mãe. Tinha dito isso a vida inteira. E, quando vi as duas listras de novo no palitinho de plástico, sentada no chão do banheiro do apartamento japonês, a primeira coisa que eu senti foi pânico.</w:t>
-      </w:r>
-    </w:p>
-    <w:p>
-      <w:r>
-        <w:t xml:space="preserve">O bebê eu queria. O pânico vinha das vozes. Eu já as ouvia, antes de contar para qualquer um. Três? Agora? Com a empresa começando? No Japão, longe de todo mundo? Vocês não têm juízo? Eu ouvia cada frase com a voz de uma tia diferente, de uma cliente diferente, de uma vizinha diferente, e as frases estavam tão bem ensaiadas dentro de mim que eu nem precisava que ninguém as dissesse.</w:t>
-      </w:r>
-    </w:p>
-    <w:p>
-      <w:r>
-        <w:t xml:space="preserve">Naquela noite, sem conseguir dormir, eu abri no celular a pasta de fotos antigas e procurei, sem saber por quê, a foto da ponte. A do bungee de cinquenta metros, dois anos antes. Eu, de capacete, lá em cima, na beira da plataforma, com um sorriso esticado e as mãos agarradas ao arnês. Fiquei olhando aquela foto por muito tempo. Os medos eram diferentes. Mas eram iguais. Medo era medo.</w:t>
-      </w:r>
-    </w:p>
-    <w:p>
-      <w:r>
-        <w:t xml:space="preserve">Contei ao Kousuke de manhã. Ele não fez planilha.</w:t>
+        <w:t xml:space="preserve">A primeira venda levou quase três meses. Eu fui a todas as reuniões com a barriga crescendo por baixo do blazer, que no fim já não fechava.</w:t>
+      </w:r>
+    </w:p>
+    <w:p>
+      <w:r>
+        <w:t xml:space="preserve">Era um casal jovem, ele de fábrica de autopeças, ela de fábrica de bentō, com um bebê de colo e uma pasta de documentos mais bagunçada do que qualquer uma que eu tinha visto na ótica. A gente passou noites organizando aquela pasta na mesa da nossa cozinha, cada papel no seu plástico, com etiqueta escrita à mão. O primeiro banco recusou. O segundo também. O terceiro aprovou. Quando o Kousuke me mostrou a mensagem do banco no celular, eu estava lavando louça, e fiquei com as mãos cheias de espuma, sem conseguir pegar o celular, olhando a tela por cima do ombro dele, lendo a palavra em japonês que eu tinha aprendido a reconhecer de tanto esperar por ela.</w:t>
+      </w:r>
+    </w:p>
+    <w:p>
+      <w:r>
+        <w:t xml:space="preserve">Depois vieram outras. Uma a cada dois ou três meses. Depois uma por mês. No ano seguinte, sem que a gente soubesse direito como, duas, três casas no mesmo mês.</w:t>
       </w:r>
     </w:p>
     <w:p>
@@ -11979,12 +12009,12 @@
         <w:ind w:firstLine="0"/>
       </w:pPr>
       <w:r>
-        <w:t xml:space="preserve">A Tiemi nasceu no ano seguinte, pequena, cabeluda, com uma franja preta que já nasceu grande demais para os olhos.</w:t>
-      </w:r>
-    </w:p>
-    <w:p>
-      <w:r>
-        <w:t xml:space="preserve">Eu estava deitada na cama do hospital, com ela dormindo no meu peito, embrulhada num cobertor branco de hospital japonês, dobrado com a precisão de um origami. O quarto estava quieto. O Kousuke tinha levado as irmãs para ver o bebê pelo vidro e depois para comer alguma coisa. Pela janela entrava uma luz de fim de tarde, e a respiração da Tiemi fazia um barulhinho de chaleira longe.</w:t>
+        <w:t xml:space="preserve">A Tiemi nasceu em outubro, pequena, cabeluda, com uma franja preta que já nasceu grande demais para os olhos.</w:t>
+      </w:r>
+    </w:p>
+    <w:p>
+      <w:r>
+        <w:t xml:space="preserve">Eu estava deitada na cama do hospital, com ela dormindo no meu peito, embrulhada num cobertor branco de hospital japonês, dobrado com a precisão de um origami. O quarto estava quieto. O Kousuke tinha ido buscar as irmãs na escola. Pela janela entrava uma luz de fim de tarde, e a respiração da Tiemi fazia um barulhinho de chaleira longe.</w:t>
       </w:r>
     </w:p>
     <w:p>
@@ -12354,7 +12384,7 @@
     </w:p>
     <w:p>
       <w:r>
-        <w:t xml:space="preserve">Eu tinha virado uma coisa que eu não sabia nomear. Uma mulher que acordava com o celular, que almoçava com o celular, que dormia com o celular embaixo do travesseiro, vibrando. Uma mãe que tratava as três filhas com a mesma fórmula, a mesma caixinha, o mesmo tom, a mesma pressa, porque não tinha tempo de descobrir o que cada uma precisava. A Mity, com nove anos, respondia com monossílabos e fechava a porta do quarto. A Ayumi chorava por coisas que eu achava pequenas. A Tiemi, ainda bebê, chamava a moça da creche de mamãe, uma vez, por engano, e eu ri na hora e chorei no carro.</w:t>
+        <w:t xml:space="preserve">Eu tinha virado uma coisa que eu não sabia nomear. Uma mulher que acordava com o celular, que almoçava com o celular, que dormia com o celular embaixo do travesseiro, vibrando. Uma mãe que tratava as três filhas com a mesma fórmula, a mesma caixinha, o mesmo tom, a mesma pressa, porque não tinha tempo de descobrir o que cada uma precisava. A Ayumi, com nove anos, respondia com monossílabos e fechava a porta do quarto. A Mity chorava por coisas que eu achava pequenas. A Tiemi, ainda bebê, chamava a moça da creche de mamãe, uma vez, por engano, e eu ri na hora e chorei no carro.</w:t>
       </w:r>
     </w:p>
     <w:p>
@@ -15203,7 +15233,7 @@
     </w:p>
     <w:p>
       <w:r>
-        <w:t xml:space="preserve">Ela não disse nada. Desmontou o cubo inteiro, girando com força, e começou de novo. Naquela mesma semana, o Kousuke comprou para ela um curso de cubo mágico pela internet, e em menos de uma semana ela montava em um minuto. Depois em menos. A Ayumi, vendo a irmã, quis aprender também, e aprendeu, depois de muito brigar com o cubo. A Tiemi, vendo as duas, pediu um. Ela tinha dois anos e montava no nível mais fácil de todos, uma cor por vez, e cada vez que terminava levantava o cubo acima da cabeça e gritava, como quem ganhou uma copa do mundo.</w:t>
+        <w:t xml:space="preserve">Ela não disse nada. Desmontou o cubo inteiro, girando com força, e começou de novo. Naquela mesma semana, o Kousuke comprou para ela um curso de cubo mágico pela internet, e em menos de uma semana ela montava em um minuto. Depois em menos. A Ayumi, vendo a irmã, quis aprender também, e aprendeu, depois de muito brigar com o cubo. A Tiemi, vendo as duas, pediu um. Ela tinha três anos e montava no nível mais fácil de todos, uma cor por vez, e cada vez que terminava levantava o cubo acima da cabeça e gritava, como quem ganhou uma copa do mundo.</w:t>
       </w:r>
     </w:p>
     <w:p>
@@ -16120,7 +16150,7 @@
     </w:p>
     <w:p>
       <w:r>
-        <w:t xml:space="preserve">"Essa da direita eu conheço desde a primeira flanela."</w:t>
+        <w:t xml:space="preserve">"Essa da direita eu conheço desde a maquete de geografia."</w:t>
       </w:r>
     </w:p>
     <w:p>
@@ -17098,7 +17128,7 @@
         <w:rPr>
           <w:i/>
         </w:rPr>
-        <w:t xml:space="preserve">Mas eu também preciso te contar o resto. Você vai ser amada por um homem que compra flanela sem precisar. Vai ter três filhas, e cada uma vai te ensinar um jeito diferente de ser mãe. A mamãe vai ajeitar a sua franja com os dedos, deitada numa cama de hospital. O papai vai rir com os ombros vendo você gritar pendurada numa ponte. Você vai gritar. Vai aprender a pedir. Vai aprender a dizer "eu errei". E um dia, numa água fria, vai deixar alguém te segurar.</w:t>
+        <w:t xml:space="preserve">Mas eu também preciso te contar o resto. Você vai ser amada por um menino de óculos que vai aparecer aí em casa com a desculpa de uma maquete de geografia e nunca mais vai parar de vir. Vai ter três filhas, e cada uma vai te ensinar um jeito diferente de ser mãe. A mamãe vai ajeitar a sua franja com os dedos, deitada numa cama de hospital. O papai vai rir com os ombros vendo você gritar pendurada numa ponte. Você vai gritar. Vai aprender a pedir. Vai aprender a dizer "eu errei". E um dia, numa água fria, vai deixar alguém te segurar.</w:t>
       </w:r>
     </w:p>
     <w:p>

</xml_diff>

<commit_message>
A Menina Elefante: segunda rodada de correções da família (cronologia)
- Kousuke um ano mais novo (27/02/1989), ajudando em matemática e física;
  namoro de idas e vindas aos 15, de verdade aos 18 (caps. 5, 10).
- Noivado no sítio dos avós dele, com a avó de 75 anos (caps. 12, 13);
  primeira estada no Japão de um ano e meio (cap. 15).
- Food truck de Okinawa: Surf and Turf (cap. 22).
- Cap. 23 na ordem certa: COVID na volta de Okinawa, os amigos, a mãe,
  o bico, o Brasil com aeroportos fechados, dois dias na Alemanha.
- Ramo imobiliário e gravidez da Tiemi na volta ao Japão (cap. 24);
  'Juju' (cap. 25); imersões de junho e novembro de 2025 (cap. 29);
  Mulheres Experience em março de 2026, no Brasil (cap. 31).
- Mity no teclado e no cubo; Ayumi dança no epílogo (cap. 33, epílogo).
- Bíblia, decisões, roteiro e .docx atualizados.

Co-Authored-By: Claude Opus 5.5 <noreply@anthropic.com>
Claude-Session: https://claude.ai/code/session_011ZTeK22H8KBNtWenzEUTZE
</commit_message>
<xml_diff>
--- a/menina_elefante/saidas/A_Menina_Elefante_V3.docx
+++ b/menina_elefante/saidas/A_Menina_Elefante_V3.docx
@@ -2434,12 +2434,12 @@
     </w:p>
     <w:p>
       <w:r>
-        <w:t xml:space="preserve">Nas terças e quintas, quem aparecia lá em casa era o Kousuke. Ele tinha dezesseis anos, dois a mais do que eu, era filho de uma família que a minha mãe conhecia da associação, e desde o começo do ano tocava a campainha com uma desculpa diferente: a maquete de geografia, a lista de física, um livro que ele jurava que eu ia precisar. Sentava na mesa da cozinha, abria o caderno e ficava. Minha mãe deixava a porta da sala aberta e passava por ali mais vezes do que precisava.</w:t>
-      </w:r>
-    </w:p>
-    <w:p>
-      <w:r>
-        <w:t xml:space="preserve">Na primeira terça, ele viu a Carla na mesa e não perguntou nada. Puxou uma cadeira do outro lado, abriu o meu livro de química e explicou balanceamento de equação para as duas, devagar, desenhando bolinhas no canto da folha. A Carla, que não falava com ninguém fazia dias, perguntou a ele por que o oxigênio vinha sempre em dupla. Ele explicou de novo, com mais bolinhas.</w:t>
+        <w:t xml:space="preserve">Nas terças e quintas, quem aparecia lá em casa era o Kousuke. Era um ano mais novo do que eu, filho de uma família que a minha mãe conhecia da associação, e sabia matemática e física como quem sabe o caminho de casa. Desde o começo do ano, tocava a campainha com uma desculpa diferente: a lista de física, a prova de trigonometria, uma apostila que ele jurava que eu ia precisar. Sentava na mesa da cozinha, abria o caderno e ficava. Minha mãe deixava a porta da sala aberta e passava por ali mais vezes do que precisava.</w:t>
+      </w:r>
+    </w:p>
+    <w:p>
+      <w:r>
+        <w:t xml:space="preserve">Na primeira terça, ele viu a Carla na mesa e não perguntou nada. Puxou uma cadeira do outro lado, abriu o meu caderno de matemática e explicou equação de segundo grau para as duas, devagar, desenhando parábolas no canto da folha. A Carla, que não falava com ninguém fazia dias, perguntou a ele por que algumas parábolas não encostavam na linha. Ele explicou de novo, com mais parábolas.</w:t>
       </w:r>
     </w:p>
     <w:p>
@@ -2449,7 +2449,7 @@
     </w:p>
     <w:p>
       <w:r>
-        <w:t xml:space="preserve">— Ele vem por causa da química?</w:t>
+        <w:t xml:space="preserve">— Ele vem por causa da matemática?</w:t>
       </w:r>
     </w:p>
     <w:p>
@@ -4886,12 +4886,12 @@
         <w:t xml:space="preserve">O Kousuke tentava namorar</w:t>
       </w:r>
       <w:r>
-        <w:t xml:space="preserve"> comigo desde os dezesseis anos.</w:t>
-      </w:r>
-    </w:p>
-    <w:p>
-      <w:r>
-        <w:t xml:space="preserve">Começou com a maquete de geografia e não parou mais. Durante quatro anos, ele tocou a campainha lá de casa com uma desculpa diferente: a lista de física, o trabalho de história de um grupo do qual ele não fazia parte, o livro que eu ia precisar no vestibular, a apostila de um cursinho que ele já tinha terminado. Sentava na mesa da cozinha, abria o caderno e ficava. Ficava depois do trabalho pronto, depois do café, depois de a minha mãe passar pela sala pela terceira vez com o pano de prato no ombro.</w:t>
+        <w:t xml:space="preserve"> comigo desde que eu tinha catorze anos.</w:t>
+      </w:r>
+    </w:p>
+    <w:p>
+      <w:r>
+        <w:t xml:space="preserve">Começou com uma lista de física e não parou mais. Ele era um ano mais novo do que eu, o que, na minha cabeça, devia ser motivo suficiente para desistir. Não era. Durante anos, ele tocou a campainha lá de casa com uma desculpa diferente: a prova de trigonometria, o trabalho de física sobre plano inclinado, a lista de matemática que eu não ia conseguir fazer sozinha e que, de fato, eu não ia conseguir fazer sozinha. Sentava na mesa da cozinha, abria o caderno e ficava. Ficava depois do exercício resolvido, depois do café, depois de a minha mãe passar pela sala pela terceira vez com o pano de prato no ombro.</w:t>
       </w:r>
     </w:p>
     <w:p>
@@ -4906,7 +4906,7 @@
     </w:p>
     <w:p>
       <w:r>
-        <w:t xml:space="preserve">— Ele já terminou a escola, filha.</w:t>
+        <w:t xml:space="preserve">— Ele é mais novo que você, filha. Quem devia estar ensinando era você.</w:t>
       </w:r>
     </w:p>
     <w:p>
@@ -4916,12 +4916,12 @@
     </w:p>
     <w:p>
       <w:r>
-        <w:t xml:space="preserve">Ele me convidou para sair a primeira vez na porta de casa, com a maquete ainda úmida de cola nas mãos. Eu disse que não podia. No ano seguinte, disse que estava estudando. Depois do infarto, disse que o meu pai estava doente, o que era verdade, e ele continuou vindo, e passou a ajudar a carregar as sacolas da farmácia sem que ninguém pedisse.</w:t>
-      </w:r>
-    </w:p>
-    <w:p>
-      <w:r>
-        <w:t xml:space="preserve">— Você vai continuar dizendo não até quando? — perguntou ele, numa tarde, na mesa da cozinha, com a minha apostila da faculdade aberta entre nós.</w:t>
+        <w:t xml:space="preserve">Aos quinze anos, a gente começou a namorar, se é que aquilo era namoro. Durava três semanas, e eu terminava por causa de uma bobagem. Ele sumia uns dias e voltava com uma lista de física. Depois do infarto do meu pai, terminei dizendo que não tinha cabeça para nada, o que era verdade, e ele continuou vindo, e passou a carregar as sacolas da farmácia sem que ninguém pedisse. Voltamos. Terminamos. Voltamos.</w:t>
+      </w:r>
+    </w:p>
+    <w:p>
+      <w:r>
+        <w:t xml:space="preserve">— Você vai continuar indo e voltando até quando? — perguntou ele, numa tarde, na mesa da cozinha, com a minha apostila da faculdade aberta entre nós.</w:t>
       </w:r>
     </w:p>
     <w:p>
@@ -4936,7 +4936,7 @@
     </w:p>
     <w:p>
       <w:r>
-        <w:t xml:space="preserve">Minha mãe, no fogão, riu alto. Eu fiquei vermelha até a orelha e disse que tudo bem, sábado, mas só um lanche, e não podia ser tarde.</w:t>
+        <w:t xml:space="preserve">Minha mãe, no fogão, riu alto. Eu fiquei vermelha até a orelha e disse que tudo bem, dessa vez de verdade, sábado, mas só um lanche, e não podia ser tarde.</w:t>
       </w:r>
     </w:p>
     <w:p>
@@ -5360,7 +5360,7 @@
           <w:sz w:val="22"/>
           <w:szCs w:val="22"/>
         </w:rPr>
-        <w:t xml:space="preserve">Por isso o Kousuke me assustou tanto. Ele não precisava de nada, e continuava voltando. Quatro anos de trabalhos de escola, seis quadras, dez passos atrás. Cada gentileza dele me deixava esperando a conta chegar, porque, na minha cabeça, ninguém fica perto de graça.</w:t>
+        <w:t xml:space="preserve">Por isso o Kousuke me assustou tanto. Ele não precisava de nada, e continuava voltando. Anos de listas de física, de idas e vindas, seis quadras, dez passos atrás. Cada gentileza dele me deixava esperando a conta chegar, porque, na minha cabeça, ninguém fica perto de graça.</w:t>
       </w:r>
     </w:p>
     <w:p>
@@ -6038,7 +6038,7 @@
     </w:p>
     <w:p>
       <w:r>
-        <w:t xml:space="preserve">Era uma festa de noventa anos, num salão da associação, com a família inteira vindo de outras cidades. No dia, meu pai não atendeu o telefone de manhã, nem à tarde, e eu passei o dia inteiro na ótica olhando para o celular. Às seis, liguei para o Kousuke e disse que não ia.</w:t>
+        <w:t xml:space="preserve">Era a festa de setenta e três anos dela, num salão da associação, com a família inteira vindo de outras cidades. No dia, meu pai não atendeu o telefone de manhã, nem à tarde, e eu passei o dia inteiro na ótica olhando para o celular. Às seis, liguei para o Kousuke e disse que não ia.</w:t>
       </w:r>
     </w:p>
     <w:p>
@@ -6324,17 +6324,17 @@
     </w:p>
     <w:p>
       <w:r>
-        <w:t xml:space="preserve">No domingo antes da viagem, ele disse que ia fazer um almoço em casa, "só para se despedir".</w:t>
-      </w:r>
-    </w:p>
-    <w:p>
-      <w:r>
-        <w:t xml:space="preserve">Quando eu cheguei, a mesa da varanda da casa dos pais dele estava arrumada para vinte pessoas.</w:t>
-      </w:r>
-    </w:p>
-    <w:p>
-      <w:r>
-        <w:t xml:space="preserve">A família dele estava toda lá, a avó de noventa anos na cabeceira, de óculos novos, que eu mesma tinha ajustado. A minha também. Minha mãe, de vestido azul, com o cabelo feito. Meus irmãos, arrumados, desconfiados, com cara de quem tinha sido avisado de alguma coisa. Minhas tias. E, na ponta da mesa, do lado oposto ao da minha mãe, meu pai.</w:t>
+        <w:t xml:space="preserve">No domingo antes da viagem, ele disse que ia fazer um almoço no sítio dos avós dele, "só para se despedir".</w:t>
+      </w:r>
+    </w:p>
+    <w:p>
+      <w:r>
+        <w:t xml:space="preserve">O sítio ficava a meia hora da cidade, no fim de uma estrada de terra, com um pé de manga na frente da casa e um galinheiro que o avô dele não deixava ninguém chegar perto. Quando eu cheguei, a mesa comprida debaixo da mangueira estava arrumada para vinte pessoas.</w:t>
+      </w:r>
+    </w:p>
+    <w:p>
+      <w:r>
+        <w:t xml:space="preserve">A família dele estava toda lá, a avó na cabeceira, com setenta e cinco anos e óculos novos, que eu mesma tinha ajustado. A minha também. Minha mãe, de vestido azul, com o cabelo feito. Meus irmãos, arrumados, desconfiados, com cara de quem tinha sido avisado de alguma coisa. Minhas tias. E, na ponta da mesa, do lado oposto ao da minha mãe, meu pai.</w:t>
       </w:r>
     </w:p>
     <w:p>
@@ -6359,7 +6359,7 @@
     </w:p>
     <w:p>
       <w:r>
-        <w:t xml:space="preserve">— A minha família come muito.</w:t>
+        <w:t xml:space="preserve">— A minha família come muito. E a minha avó não sai do sítio.</w:t>
       </w:r>
     </w:p>
     <w:p>
@@ -6398,7 +6398,7 @@
     </w:p>
     <w:p>
       <w:r>
-        <w:t xml:space="preserve">Ele não bateu no copo com a colher. Só ficou em pé, e aos poucos a mesa foi ficando quieta, uma ponta depois da outra, até sobrar só o barulho do ventilador de teto.</w:t>
+        <w:t xml:space="preserve">Ele não bateu no copo com a colher. Só ficou em pé, e aos poucos a mesa foi ficando quieta, uma ponta depois da outra, até sobrar só o barulho das cigarras.</w:t>
       </w:r>
     </w:p>
     <w:p>
@@ -6452,7 +6452,7 @@
         <w:ind w:firstLine="0"/>
       </w:pPr>
       <w:r>
-        <w:t xml:space="preserve">Eu não me lembro de tudo o que ele disse depois. Lembro que foi curto, que não tinha juros compostos, que ele disse que queria ir para o Japão comigo e voltar comigo e o que viesse depois também. Lembro que ele se ajoelhou no chão de cerâmica da varanda e que o joelho fez um barulho alto e que a avó dele disse "cuidado" em japonês.</w:t>
+        <w:t xml:space="preserve">Eu não me lembro de tudo o que ele disse depois. Lembro que foi curto, que não tinha juros compostos, que ele disse que queria ir para o Japão comigo e voltar comigo e o que viesse depois também. Lembro que ele se ajoelhou na terra, debaixo da mangueira, e que o joelho fez um barulho alto e que a avó dele disse "cuidado" em japonês.</w:t>
       </w:r>
     </w:p>
     <w:p>
@@ -6570,7 +6570,7 @@
           <w:sz w:val="22"/>
           <w:szCs w:val="22"/>
         </w:rPr>
-        <w:t xml:space="preserve">"Como assim, eu?" foi o que pensei, com o Kousuke ajoelhado no chão da varanda.</w:t>
+        <w:t xml:space="preserve">"Como assim, eu?" foi o que pensei, com o Kousuke ajoelhado na terra do sítio, debaixo da mangueira.</w:t>
       </w:r>
     </w:p>
     <w:p>
@@ -7163,7 +7163,7 @@
     </w:p>
     <w:p>
       <w:r>
-        <w:t xml:space="preserve">Foi numa noite de outubro de 2010, no apartamento de tatami, com a planilha do Kousuke aberta no notebook em cima da mesinha baixa. Um ano e oito meses de fábrica. A poupança do intercâmbio estava lá, na última linha, em ienes e convertida em reais, e não dava. Faltava pouco, mas faltava, e a escola de idiomas que a gente queria tinha subido o preço, e o visto de estudante tinha exigências que a planilha não tinha previsto. O Kousuke passou uma semana tentando fazer as contas fecharem. Eu passei uma semana esperando que ele desistisse de tentar.</w:t>
+        <w:t xml:space="preserve">Foi numa noite de outubro de 2010, no apartamento de tatami, com a planilha do Kousuke aberta no notebook em cima da mesinha baixa. Um ano e quatro meses de fábrica. A poupança do intercâmbio estava lá, na última linha, em ienes e convertida em reais, e não dava. Faltava pouco, mas faltava, e a escola de idiomas que a gente queria tinha subido o preço, e o visto de estudante tinha exigências que a planilha não tinha previsto. O Kousuke passou uma semana tentando fazer as contas fecharem. Eu passei uma semana esperando que ele desistisse de tentar.</w:t>
       </w:r>
     </w:p>
     <w:p>
@@ -8806,7 +8806,7 @@
         <w:ind w:firstLine="0"/>
       </w:pPr>
       <w:r>
-        <w:t xml:space="preserve">Voltamos com as duas pequenas, a Ayumi com três anos, puxando uma mochilinha de rodinhas cheia de brinquedo que não podia ser despachado, e a Mity com um ano, no colo, puxando o meu cabelo.</w:t>
+        <w:t xml:space="preserve">Voltamos com as duas pequenas, a Ayumi com três anos, puxando uma mochilinha de rodinhas cheia de brinquedo que não podia ser despachado, e a Mity com um ano e meio, no colo, puxando o meu cabelo.</w:t>
       </w:r>
     </w:p>
     <w:p>
@@ -10320,7 +10320,7 @@
     </w:p>
     <w:p>
       <w:r>
-        <w:t xml:space="preserve">Ele entendia de investimento. Sempre tinha entendido; lia sobre isso desde o tempo da maquete de geografia, falava de juros compostos em pedido de casamento. Nas noites de sexta, depois da planilha da casa, ficava vendo vídeos sobre bolsa, sobre fundos, sobre como os brasileiros no Japão deixavam o dinheiro parado no banco sem render nada. Eu olhei para aquilo e vi um curso.</w:t>
+        <w:t xml:space="preserve">Ele entendia de investimento. Sempre tinha entendido; lia sobre isso desde o tempo das listas de física, falava de juros compostos em pedido de casamento. Nas noites de sexta, depois da planilha da casa, ficava vendo vídeos sobre bolsa, sobre fundos, sobre como os brasileiros no Japão deixavam o dinheiro parado no banco sem render nada. Eu olhei para aquilo e vi um curso.</w:t>
       </w:r>
     </w:p>
     <w:p>
@@ -10804,27 +10804,27 @@
     </w:p>
     <w:p>
       <w:r>
-        <w:t xml:space="preserve">A ideia tinha chegado antes de qualquer outra coisa, no meio de 2021, como chegam as ideias que dão certo nos filmes: de repente, inteira, brilhante. Okinawa. O turismo voltando depois do pior da pandemia. Praias, estradas, estacionamentos cheios de carros alugados. E um food truck brasileiro, com pastel. Pastel de carne, de queijo, de palmito, frito na hora, massa fina, estourando bolha, do jeito que a feira da minha cidade fazia e que nenhum japonês de Okinawa conhecia.</w:t>
-      </w:r>
-    </w:p>
-    <w:p>
-      <w:r>
-        <w:t xml:space="preserve">— Pastel é japonês — disse o Kousuke, na primeira conversa. — Foi imigrante japonês que inventou no Brasil. Vai ser uma volta para casa.</w:t>
-      </w:r>
-    </w:p>
-    <w:p>
-      <w:r>
-        <w:t xml:space="preserve">— Isso é verdade?</w:t>
-      </w:r>
-    </w:p>
-    <w:p>
-      <w:r>
-        <w:t xml:space="preserve">— É o que dizem.</w:t>
-      </w:r>
-    </w:p>
-    <w:p>
-      <w:r>
-        <w:t xml:space="preserve">— Então vai ser um sucesso.</w:t>
+        <w:t xml:space="preserve">A ideia tinha chegado antes de qualquer outra coisa, no meio de 2021, como chegam as ideias que dão certo nos filmes: de repente, inteira, brilhante. Okinawa. O turismo voltando depois do pior da pandemia. Praias, estradas, estacionamentos cheios de carros alugados. E um food truck com um prato que a gente mesmo inventou e batizou de Surf and Turf: uma tigela de arroz com alho, frutos do mar fritos por cima, peixe, lula e camarão, e torresmo a pururuca, e por cima de tudo um vinagrete de cebola roxa apimentada. O mar e a terra na mesma tigela. Okinawa come porco de todo jeito, a orelha, a barriga, o pé, mas ninguém ali tinha visto um torresmo estourar a pururuca.</w:t>
+      </w:r>
+    </w:p>
+    <w:p>
+      <w:r>
+        <w:t xml:space="preserve">— Torresmo com camarão? — disse o Kousuke, na primeira conversa. — Ninguém vai entender.</w:t>
+      </w:r>
+    </w:p>
+    <w:p>
+      <w:r>
+        <w:t xml:space="preserve">— Vão entender quando provarem.</w:t>
+      </w:r>
+    </w:p>
+    <w:p>
+      <w:r>
+        <w:t xml:space="preserve">— E se não provarem?</w:t>
+      </w:r>
+    </w:p>
+    <w:p>
+      <w:r>
+        <w:t xml:space="preserve">— Vão provar. É só pôr o alho no óleo perto da praia.</w:t>
       </w:r>
     </w:p>
     <w:p>
@@ -10877,7 +10877,7 @@
         <w:ind w:firstLine="0"/>
       </w:pPr>
       <w:r>
-        <w:t xml:space="preserve">As primeiras semanas foram de preparação. O truck, a licença, o fornecedor de farinha, o óleo. O gerador que falhava. A cozinha do apartamento alugado virou uma fábrica de massa de pastel, com a Mity e a Ayumi fechando os pastéis com o garfo na borda, apertando demais, abrindo buracos, rindo. O Kousuke fazia as contas e dirigia. Eu fritava.</w:t>
+        <w:t xml:space="preserve">As primeiras semanas foram de preparação. O truck, a licença, o fornecedor de frutos do mar, o óleo. O gerador que falhava. A cozinha do apartamento alugado virou um laboratório: a pele de porco secando numa grade para estourar depois, a panela de arroz com alho, a cebola roxa curtindo no vinagre com pimenta. A Ayumi e a Mity provavam o vinagrete com a ponta do dedo, faziam careta e pediam mais. O Kousuke fazia as contas e dirigia. Eu fritava.</w:t>
       </w:r>
     </w:p>
     <w:p>
@@ -10916,12 +10916,12 @@
     </w:p>
     <w:p>
       <w:r>
-        <w:t xml:space="preserve">Estacionamos num terreno perto de uma praia movimentada, montamos o toldo, ligamos o gerador, que funcionou na segunda tentativa. Pus a primeira massa no óleo. O cheiro subiu, aquele cheiro de feira de domingo, de infância, de tia fritando pastel para a família de doze irmãos, e eu fiquei com os olhos cheios d'água atrás da máscara.</w:t>
-      </w:r>
-    </w:p>
-    <w:p>
-      <w:r>
-        <w:t xml:space="preserve">Os primeiros clientes foram curiosos. Japoneses de férias que olhavam o cardápio com desconfiança, apontavam para a foto, experimentavam de pé, com o pastel pingando óleo no papel, e faziam aquela cara de surpresa boa que os japoneses fazem quando uma coisa é melhor do que esperavam. Um senhor voltou no dia seguinte com a família inteira. Uma moça fotografou o pastel de todos os ângulos antes de comer.</w:t>
+        <w:t xml:space="preserve">Estacionamos num terreno perto de uma praia movimentada, montamos o toldo, ligamos o gerador, que funcionou na segunda tentativa. Joguei o primeiro punhado de alho no óleo. O cheiro subiu, aquele cheiro de almoço de domingo, de infância, de tia fritando torresmo para a família de doze irmãos, e eu fiquei com os olhos cheios d'água atrás da máscara.</w:t>
+      </w:r>
+    </w:p>
+    <w:p>
+      <w:r>
+        <w:t xml:space="preserve">Os primeiros clientes foram curiosos. Japoneses de férias que olhavam o cardápio com desconfiança, apontavam para a foto, experimentavam de pé, com a tigela de papel na mão e o torresmo estalando no dente, e faziam aquela cara de surpresa boa que os japoneses fazem quando uma coisa é melhor do que esperavam. Um senhor voltou no dia seguinte com a família inteira. Uma moça fotografou a tigela de todos os ângulos antes de comer.</w:t>
       </w:r>
     </w:p>
     <w:p>
@@ -10941,7 +10941,7 @@
     </w:p>
     <w:p>
       <w:r>
-        <w:t xml:space="preserve">Nas semanas seguintes, as praias esvaziaram. Os estacionamentos esvaziaram. Os carros alugados sumiram. A gente continuou abrindo o truck, todos os dias, por teimosia, e fritava dez pastéis numa tarde inteira, e jogava fora a massa que sobrava, e ligava o gerador que falhava para iluminar um terreno onde não havia ninguém.</w:t>
+        <w:t xml:space="preserve">Nas semanas seguintes, as praias esvaziaram. Os estacionamentos esvaziaram. Os carros alugados sumiram. A gente continuou abrindo o truck, todos os dias, por teimosia, e vendia dez tigelas numa tarde inteira, e jogava fora o arroz que sobrava, e ligava o gerador que falhava para iluminar um terreno onde não havia ninguém.</w:t>
       </w:r>
     </w:p>
     <w:p>
@@ -11090,7 +11090,7 @@
           <w:sz w:val="22"/>
           <w:szCs w:val="22"/>
         </w:rPr>
-        <w:t xml:space="preserve">O dinheiro que a gente não tinha, a planilha que dependia de um feriado, o gerador falhando para iluminar um terreno vazio. Eu fritava dez pastéis numa tarde e jogava fora a massa que sobrava. Parecia o fim.</w:t>
+        <w:t xml:space="preserve">O dinheiro que a gente não tinha, a planilha que dependia de um feriado, o gerador falhando para iluminar um terreno vazio. Eu vendia dez tigelas numa tarde e jogava fora o arroz que sobrava. Parecia o fim.</w:t>
       </w:r>
     </w:p>
     <w:p>
@@ -11328,30 +11328,30 @@
         <w:rPr>
           <w:smallCaps/>
         </w:rPr>
-        <w:t xml:space="preserve">Às três da manhã,</w:t>
-      </w:r>
-      <w:r>
-        <w:t xml:space="preserve"> na fábrica de marmitas, o arroz chegava numa esteira ainda soltando vapor.</w:t>
-      </w:r>
-    </w:p>
-    <w:p>
-      <w:r>
-        <w:t xml:space="preserve">Era o meu arubaito, o bico, o trabalho temporário que dava para pegar de um dia para o outro sem entrevista. Três noites por semana, das dez da noite às seis da manhã, de touca, máscara, avental e luvas de plástico, numa linha de senhoras japonesas e brasileiras que montavam os bentō das lojas de conveniência para o dia seguinte. Cada uma punha uma coisa. Eu punha o ovo. Um pedaço de omelete doce, amarelo, retangular, no canto esquerdo de cada caixinha, milhares de vezes por noite, até o ovo ficar pesado na mão.</w:t>
-      </w:r>
-    </w:p>
-    <w:p>
-      <w:r>
-        <w:t xml:space="preserve">Tinha voltado para a linha. Só que agora de noite.</w:t>
-      </w:r>
-    </w:p>
-    <w:p>
-      <w:r>
-        <w:t xml:space="preserve">A gente estava fora da fábrica fazia mais de seis meses, sem seguro-desemprego, com a dívida de Okinawa no bolso e uma coisa nova que o Kousuke chamava de oportunidade e que eu chamava, em silêncio, de mais uma. O mercado imobiliário. Ele tinha começado a trabalhar como corretor, atendendo brasileiros que queriam comprar casa no Japão, e passava os dias explicando papel para gente que não entendia papel: comprovante de renda, comprovante de imposto, atestado de residência, tudo com nome em japonês, tudo com prazo. Ele era bom nisso. Mas vender, para quem nunca vendeu, é difícil. Os meses passavam, e ninguém assinava nada.</w:t>
-      </w:r>
-    </w:p>
-    <w:p>
-      <w:r>
-        <w:t xml:space="preserve">Então fazíamos o que aparecia. Eu, a fábrica de marmitas. Ele, carregamento de caminhão num depósito aos sábados. Chegávamos em casa em horários trocados e deixávamos recado um para o outro colado na porta da geladeira, como dois colegas de turno.</w:t>
+        <w:t xml:space="preserve">Voltamos de Okinawa em</w:t>
+      </w:r>
+      <w:r>
+        <w:t xml:space="preserve"> setembro com a dívida no bolso e a COVID no corpo.</w:t>
+      </w:r>
+    </w:p>
+    <w:p>
+      <w:r>
+        <w:t xml:space="preserve">Eu primeiro, depois ele, com dois dias de diferença. A febre começou na semana da volta, com as malas ainda fechadas no corredor, e veio como uma parede. O hokenjo, o centro de saúde da prefeitura, ligava todo dia de manhã para perguntar a temperatura e a oxigenação, e deixou na porta do apartamento uma caixa de papelão com arroz instantâneo, água, macarrão de copo e um oxímetro pequenininho, do tamanho de um prendedor de roupa, que a gente prendia no dedo e olhava como quem olha um oráculo.</w:t>
+      </w:r>
+    </w:p>
+    <w:p>
+      <w:r>
+        <w:t xml:space="preserve">Os números desceram. Os meus, depois os dele. Houve uma noite em que eu acordei sem ar, com o peito pesado como se tivesse uma pessoa sentada em cima, e prendi o oxímetro no dedo no escuro e vi o número piscar, e descer, e piscar. O Kousuke estava ao meu lado, pior do que eu, respirando curto, dormindo um sono ruim. As meninas estavam no quarto delas. Quem segurou a casa naqueles dias foram os amigos. Uma amiga da igreja deixava comida no genkan e conversava com as meninas pela porta fechada. Um casal da cidade fazia as compras e mandava foto da nota pelo celular. Alguém que eu mal conhecia deixou na porta um saco de laranjas com um bilhete em português: "Melhoras."</w:t>
+      </w:r>
+    </w:p>
+    <w:p>
+      <w:r>
+        <w:t xml:space="preserve">No grupo dos brasileiros da cidade, naquela semana, alguém escreveu que um conhecido de um conhecido não tinha voltado do hospital. Depois outro. Eu parei de abrir o grupo.</w:t>
+      </w:r>
+    </w:p>
+    <w:p>
+      <w:r>
+        <w:t xml:space="preserve">Tive medo de não voltar. Tive medo de deixar as duas. Tive medo de não dar tempo. Fiquei deitada de lado, no futon, com o oxímetro no dedo, olhando a porta do quarto delas, e rezei, pela primeira vez em muito tempo, pedindo uma coisa para mim.</w:t>
       </w:r>
     </w:p>
     <w:p>
@@ -11370,27 +11370,42 @@
         <w:ind w:firstLine="0"/>
       </w:pPr>
       <w:r>
-        <w:t xml:space="preserve">Em setembro, os dois pegaram COVID.</w:t>
-      </w:r>
-    </w:p>
-    <w:p>
-      <w:r>
-        <w:t xml:space="preserve">Eu primeiro, depois ele, com dois dias de diferença. A febre veio como uma parede. O hokenjo, o centro de saúde da prefeitura, ligava todo dia de manhã para perguntar a temperatura e a oxigenação, e deixou na porta do apartamento uma caixa de papelão com arroz instantâneo, água, macarrão de copo e um oxímetro pequenininho, do tamanho de um prendedor de roupa, que a gente prendia no dedo e olhava como quem olha um oráculo.</w:t>
-      </w:r>
-    </w:p>
-    <w:p>
-      <w:r>
-        <w:t xml:space="preserve">Os números desceram. Os meus, depois os dele. Houve uma noite em que eu acordei sem ar, com o peito pesado como se tivesse uma pessoa sentada em cima, e prendi o oxímetro no dedo no escuro e vi o número piscar, e descer, e piscar. O Kousuke estava ao meu lado, pior do que eu, respirando curto, dormindo um sono ruim. As meninas estavam no quarto delas, com uma amiga da igreja que passava deixando comida no genkan e conversando com elas pela porta fechada.</w:t>
-      </w:r>
-    </w:p>
-    <w:p>
-      <w:r>
-        <w:t xml:space="preserve">No grupo dos brasileiros da cidade, naquela semana, alguém escreveu que um conhecido de um conhecido não tinha voltado do hospital. Depois outro. Eu parei de abrir o grupo.</w:t>
-      </w:r>
-    </w:p>
-    <w:p>
-      <w:r>
-        <w:t xml:space="preserve">Tive medo de não voltar. Tive medo de deixar as duas. Tive medo de não dar tempo. Fiquei deitada de lado, no futon, com o oxímetro no dedo, olhando a porta do quarto delas, e rezei, pela primeira vez em muito tempo, pedindo uma coisa para mim.</w:t>
+        <w:t xml:space="preserve">Minha mãe chegou quando a gente já não estava morrendo, mas ainda não conseguia levantar.</w:t>
+      </w:r>
+    </w:p>
+    <w:p>
+      <w:r>
+        <w:t xml:space="preserve">Tinha vindo do Brasil assim que soube, para cuidar das meninas, com o visto que ainda valia, depois de uma quarentena que passou num hotel perto do aeroporto, reclamando da comida, por mensagem, três vezes por dia. Chegou de máscara dupla, com a mesma mala azul amarrada com fita vermelha, e antes de tirar o sapato no genkan já estava perguntando onde eu guardava a panela grande.</w:t>
+      </w:r>
+    </w:p>
+    <w:p>
+      <w:r>
+        <w:t xml:space="preserve">Naquela noite, eu acordei com o cheiro.</w:t>
+      </w:r>
+    </w:p>
+    <w:p>
+      <w:r>
+        <w:t xml:space="preserve">Era canja. Canja de galinha com arroz, do jeito que ela fazia quando eu era pequena e ficava de cama, com salsinha e um fio de óleo por cima. O cheiro entrava pela fresta da porta do quarto, e eu fiquei deitada respirando aquele cheiro devagar, com o pulmão que ainda doía, porque era a primeira coisa em dez dias que tinha gosto de alguma coisa.</w:t>
+      </w:r>
+    </w:p>
+    <w:p>
+      <w:r>
+        <w:t xml:space="preserve">A porta abriu. Minha mãe entrou com uma bandeja. Tinha achado, no fundo do armário, as duas únicas tigelas boas que a gente tinha, as de borda azul, e tinha posto uma colher em cada uma, e um guardanapo de papel dobrado em triângulo, e dois copos de água.</w:t>
+      </w:r>
+    </w:p>
+    <w:p>
+      <w:r>
+        <w:t xml:space="preserve">Ela pôs a bandeja em cima do futon, entre mim e o Kousuke, e se sentou no chão, de joelhos, esperando.</w:t>
+      </w:r>
+    </w:p>
+    <w:p>
+      <w:r>
+        <w:t xml:space="preserve">Eu olhei para aquela bandeja por muito tempo. Tinha servido café para uma sala inteira aos quinze anos. Tinha deixado panela no fogão do meu pai à meia-noite, por anos. Tinha descascado pera num quarto de hospital. Nunca, que eu lembrasse, ninguém tinha trazido uma bandeja para mim.</w:t>
+      </w:r>
+    </w:p>
+    <w:p>
+      <w:r>
+        <w:t xml:space="preserve">— Come, filha — disse ela. — Está quente.</w:t>
       </w:r>
     </w:p>
     <w:p>
@@ -11409,42 +11424,27 @@
         <w:ind w:firstLine="0"/>
       </w:pPr>
       <w:r>
-        <w:t xml:space="preserve">Minha mãe chegou quando a gente já não estava morrendo, mas ainda não conseguia levantar.</w:t>
-      </w:r>
-    </w:p>
-    <w:p>
-      <w:r>
-        <w:t xml:space="preserve">Tinha vindo do Brasil assim que soube, com o visto que ainda valia, depois de uma quarentena que passou num hotel perto do aeroporto, reclamando da comida, por mensagem, três vezes por dia. Chegou de máscara dupla, com a mesma mala azul amarrada com fita vermelha, e antes de tirar o sapato no genkan já estava perguntando onde eu guardava a panela grande.</w:t>
-      </w:r>
-    </w:p>
-    <w:p>
-      <w:r>
-        <w:t xml:space="preserve">Naquela noite, eu acordei com o cheiro.</w:t>
-      </w:r>
-    </w:p>
-    <w:p>
-      <w:r>
-        <w:t xml:space="preserve">Era canja. Canja de galinha com arroz, do jeito que ela fazia quando eu era pequena e ficava de cama, com salsinha e um fio de óleo por cima. O cheiro entrava pela fresta da porta do quarto, e eu fiquei deitada respirando aquele cheiro devagar, com o pulmão que ainda doía, porque era a primeira coisa em dez dias que tinha gosto de alguma coisa.</w:t>
-      </w:r>
-    </w:p>
-    <w:p>
-      <w:r>
-        <w:t xml:space="preserve">A porta abriu. Minha mãe entrou com uma bandeja. Tinha achado, no fundo do armário, as duas únicas tigelas boas que a gente tinha, as de borda azul, e tinha posto uma colher em cada uma, e um guardanapo de papel dobrado em triângulo, e dois copos de água.</w:t>
-      </w:r>
-    </w:p>
-    <w:p>
-      <w:r>
-        <w:t xml:space="preserve">Ela pôs a bandeja em cima do futon, entre mim e o Kousuke, e se sentou no chão, de joelhos, esperando.</w:t>
-      </w:r>
-    </w:p>
-    <w:p>
-      <w:r>
-        <w:t xml:space="preserve">Eu olhei para aquela bandeja por muito tempo. Tinha servido café para uma sala inteira aos quinze anos. Tinha deixado panela no fogão do meu pai à meia-noite, por anos. Tinha descascado pera num quarto de hospital. Nunca, que eu lembrasse, ninguém tinha trazido uma bandeja para mim.</w:t>
-      </w:r>
-    </w:p>
-    <w:p>
-      <w:r>
-        <w:t xml:space="preserve">— Come, filha — disse ela. — Está quente.</w:t>
+        <w:t xml:space="preserve">Quando consegui ficar em pé, voltei para a linha.</w:t>
+      </w:r>
+    </w:p>
+    <w:p>
+      <w:r>
+        <w:t xml:space="preserve">Às três da manhã, na fábrica de marmitas, o arroz chegava numa esteira ainda soltando vapor.</w:t>
+      </w:r>
+    </w:p>
+    <w:p>
+      <w:r>
+        <w:t xml:space="preserve">Era o meu arubaito, o bico, o trabalho temporário que dava para pegar de um dia para o outro sem entrevista. Três noites por semana, das dez da noite às seis da manhã, de touca, máscara, avental e luvas de plástico, numa linha de senhoras japonesas e brasileiras que montavam os bentō das lojas de conveniência para o dia seguinte. Cada uma punha uma coisa. Eu punha o ovo. Um pedaço de omelete doce, amarelo, retangular, no canto esquerdo de cada caixinha, milhares de vezes por noite, até o ovo ficar pesado na mão.</w:t>
+      </w:r>
+    </w:p>
+    <w:p>
+      <w:r>
+        <w:t xml:space="preserve">A gente estava fora da fábrica fazia mais de seis meses, sem seguro-desemprego, com a dívida de Okinawa no bolso e nenhuma ideia nova. Quer dizer: o Kousuke tinha uma. Passava as noites estudando o mercado imobiliário, os bancos, os documentos que um estrangeiro precisava para comprar uma casa no Japão, e falava daquilo como oportunidade. Eu chamava, em silêncio, de mais uma. Minha mãe, que ainda estava com a gente, ouvia os dois da cozinha e não dava opinião, o que nela era uma opinião.</w:t>
+      </w:r>
+    </w:p>
+    <w:p>
+      <w:r>
+        <w:t xml:space="preserve">Então fazíamos o que aparecia. Eu, a fábrica de marmitas. Ele, carregamento de caminhão num depósito aos sábados. Chegávamos em casa em horários trocados e deixávamos recado um para o outro colado na porta da geladeira, como dois colegas de turno.</w:t>
       </w:r>
     </w:p>
     <w:p>
@@ -11468,7 +11468,7 @@
     </w:p>
     <w:p>
       <w:r>
-        <w:t xml:space="preserve">Era para ser um mês. Virou três, com voos cancelados, testes, regras que mudavam de uma semana para a outra. O Kousuke trabalhou de lá mesmo, pelo celular, atendendo cliente em horário japonês, de madrugada, na varanda da casa da minha mãe. Meu pai apareceu uma vez, num domingo, de ônibus, com um pacote de bolacha de água e sal para as meninas e a camisa com um botão a mais aberto. Ficou uma hora na varanda, contou a baleia para as meninas, que já sabiam de cor e deixaram ele contar, e foi embora antes do almoço, porque minha mãe estava na cozinha. Eu andava pelo Rio, na casa de parentes, com uma mistura de alívio e de coisa presa que eu não sabia o que era. Num dia nublado, no mirante do Leblon, discuti com o Kousuke por uma bobagem, alguma coisa sobre horário, e depois fiquei olhando o mar batendo nas pedras com raiva de mim mesma, do meu pavio curto, da minha pressa de querer o amanhã hoje.</w:t>
+        <w:t xml:space="preserve">Era para ser um mês. Virou três: veio uma variante nova, as fronteiras e os aeroportos foram fechando, os voos foram cancelados um atrás do outro, e as regras de entrada mudavam de uma semana para a outra. O Kousuke trabalhou de lá mesmo, pelo celular, atendendo cliente em horário japonês, de madrugada, na varanda da casa da minha mãe. Meu pai apareceu uma vez, num domingo, de ônibus, com um pacote de bolacha de água e sal para as meninas e a camisa com um botão a mais aberto. Ficou uma hora na varanda, contou a baleia para as meninas, que já sabiam de cor e deixaram ele contar, e foi embora antes do almoço, porque minha mãe estava na cozinha. Eu andava pelo Rio, na casa de parentes, com uma mistura de alívio e de coisa presa que eu não sabia o que era. Num dia nublado, no mirante do Leblon, discuti com o Kousuke por uma bobagem, alguma coisa sobre horário, e depois fiquei olhando o mar batendo nas pedras com raiva de mim mesma, do meu pavio curto, da minha pressa de querer o amanhã hoje.</w:t>
       </w:r>
     </w:p>
     <w:p>
@@ -11657,7 +11657,7 @@
     </w:p>
     <w:p>
       <w:r>
-        <w:t xml:space="preserve">E, na volta, em março, ficamos presos na Alemanha.</w:t>
+        <w:t xml:space="preserve">E, na volta, em março, ficamos dois dias presos na Alemanha.</w:t>
       </w:r>
     </w:p>
     <w:p>
@@ -11683,6 +11683,11 @@
     <w:p>
       <w:r>
         <w:t xml:space="preserve">Eu não sabia. Balancei a cabeça e continuei rindo, baixinho, para não acordar as meninas, até sentir as lágrimas descerem por dentro da máscara.</w:t>
+      </w:r>
+    </w:p>
+    <w:p>
+      <w:r>
+        <w:t xml:space="preserve">No dia seguinte, com o teste feito e o resultado prometido para a noite, a gente fez o que dava para fazer. Guardou as malas, pegou um trem para a cidade e andou. Comemos salsicha de pé numa barraquinha, com mostarda escorrendo nos dedos. As meninas, de gorro, correram atrás dos pombos numa praça de pedra. O Kousuke tirou uma foto das meninas na frente de uma igreja cujo nome nenhum de nós sabia. Na foto, a Ayumi está de gorro torto e a Mity com a mão esticada para um pombo que já tinha ido embora.</w:t>
       </w:r>
     </w:p>
     <w:p>
@@ -11779,7 +11784,7 @@
           <w:sz w:val="22"/>
           <w:szCs w:val="22"/>
         </w:rPr>
-        <w:t xml:space="preserve">Depois veio a rampa da Pedra Bonita, e eu corri para o nada. E veio a noite presa num aeroporto da Alemanha, as meninas dormindo em cima das malas, e aquele riso que subiu de baixo, sem motivo. Hoje eu sei o motivo: eu estava viva, com as pessoas que eu amo, e nada daquilo cabia numa planilha.</w:t>
+        <w:t xml:space="preserve">Depois veio a rampa da Pedra Bonita, e eu corri para o nada. E vieram os dois dias presos na Alemanha, as meninas dormindo em cima das malas, aquele riso que subiu de baixo, sem motivo, e uma praça de pedra que não estava em plano nenhum. Hoje eu sei o motivo: eu estava viva, com as pessoas que eu amo, e nada daquilo cabia numa planilha.</w:t>
       </w:r>
     </w:p>
     <w:p>
@@ -11902,7 +11907,7 @@
         <w:ind w:firstLine="0"/>
       </w:pPr>
       <w:r>
-        <w:t xml:space="preserve">Quando a gente voltou da Alemanha, o Kousuke decidiu que ia trabalhar como corretor sozinho, por conta própria, e eu decidi, sem que ninguém pedisse, que ia ajudar.</w:t>
+        <w:t xml:space="preserve">Quando a gente voltou da Alemanha, o Kousuke decidiu que era a hora do mercado imobiliário: ia trabalhar como corretor, por conta própria, e eu decidi, sem que ninguém pedisse, que ia ajudar.</w:t>
       </w:r>
     </w:p>
     <w:p>
@@ -11941,7 +11946,7 @@
         <w:ind w:firstLine="0"/>
       </w:pPr>
       <w:r>
-        <w:t xml:space="preserve">Três semanas depois de voltar, com as malas ainda abertas no corredor, eu descobri que estava grávida da terceira. Pelas contas da médica, ela tinha vindo com a gente do Brasil. Tinha atravessado a COVID na Bahia e a noite no aeroporto da Alemanha sem que ninguém soubesse, nem eu.</w:t>
+        <w:t xml:space="preserve">Logo que chegamos, com as malas ainda abertas no corredor, eu descobri que estava grávida da terceira. Pelas contas da médica, ela tinha vindo com a gente do Brasil. Tinha atravessado a COVID na Bahia e a noite no aeroporto da Alemanha sem que ninguém soubesse, nem eu.</w:t>
       </w:r>
     </w:p>
     <w:p>
@@ -12384,7 +12389,7 @@
     </w:p>
     <w:p>
       <w:r>
-        <w:t xml:space="preserve">Eu tinha virado uma coisa que eu não sabia nomear. Uma mulher que acordava com o celular, que almoçava com o celular, que dormia com o celular embaixo do travesseiro, vibrando. Uma mãe que tratava as três filhas com a mesma fórmula, a mesma caixinha, o mesmo tom, a mesma pressa, porque não tinha tempo de descobrir o que cada uma precisava. A Ayumi, com nove anos, respondia com monossílabos e fechava a porta do quarto. A Mity chorava por coisas que eu achava pequenas. A Tiemi, ainda bebê, chamava a moça da creche de mamãe, uma vez, por engano, e eu ri na hora e chorei no carro.</w:t>
+        <w:t xml:space="preserve">Eu tinha virado uma coisa que eu não sabia nomear. Uma mulher que acordava com o celular, que almoçava com o celular, que dormia com o celular embaixo do travesseiro, vibrando. Uma mãe que tratava as três filhas com a mesma fórmula, a mesma caixinha, o mesmo tom, a mesma pressa, porque não tinha tempo de descobrir o que cada uma precisava. A Ayumi, com nove anos, respondia com monossílabos e fechava a porta do quarto. A Mity chorava por coisas que eu achava pequenas. A Tiemi, ainda bebê, quando caía, corria chorando para a Ayumi, chamando "Juju", o apelido que tinha inventado para a irmã, e não para mim, e eu ri na hora e chorei no carro.</w:t>
       </w:r>
     </w:p>
     <w:p>
@@ -14269,7 +14274,7 @@
     </w:p>
     <w:p>
       <w:r>
-        <w:t xml:space="preserve">Oito países. Cursos, imersões, eventos, fotos bonitas em todos os lugares. E uma empresa nova, só minha, que eu comecei a montar no meio do ano, sem pedir licença a ninguém, com a mesma certeza com que tinha comprado o curso de oito mil reais às duas da manhã. Quando eu quero, eu quero. E agora.</w:t>
+        <w:t xml:space="preserve">Oito países. Cursos, imersões, eventos, fotos bonitas em todos os lugares. Em junho, passei um mês no Brasil, numa imersão, e voltei cheia de planos. E uma empresa nova, só minha, que eu comecei a montar no meio do ano, sem pedir licença a ninguém, com a mesma certeza com que tinha comprado o curso de oito mil reais às duas da manhã. Quando eu quero, eu quero. E agora.</w:t>
       </w:r>
     </w:p>
     <w:p>
@@ -14373,7 +14378,7 @@
     </w:p>
     <w:p>
       <w:r>
-        <w:t xml:space="preserve">Nas semanas seguintes, a gente continuou trabalhando junto. Continuou respondendo cliente, levando as meninas na escola, jantando na mesma mesa. Mas falava só o necessário, pelo celular, mesmo estando na mesma casa. Em novembro, eu comprei uma passagem para o Brasil, para um curso de uma semana em São Paulo. Contei a ele depois de comprar. Ele disse "tudo bem", com a mesma voz com que tinha dito "tudo bem" no tempo do "então escolhe". Uma amiga da igreja, a Lê, ficou com as meninas.</w:t>
+        <w:t xml:space="preserve">Nas semanas seguintes, a gente continuou trabalhando junto. Continuou respondendo cliente, levando as meninas na escola, jantando na mesma mesa. Mas falava só o necessário, pelo celular, mesmo estando na mesma casa. Em novembro, eu comprei uma passagem para o Brasil, para mais uma imersão, e para ficar um mês. Contei a ele depois de comprar. Ele disse "tudo bem", com a mesma voz com que tinha dito "tudo bem" no tempo do "então escolhe". Uma amiga da igreja, a Lê, ficou com as meninas.</w:t>
       </w:r>
     </w:p>
     <w:p>
@@ -14529,7 +14534,7 @@
         <w:ind w:firstLine="0"/>
       </w:pPr>
       <w:r>
-        <w:t xml:space="preserve">No sábado depois do curso, fui ver meu pai.</w:t>
+        <w:t xml:space="preserve">Num sábado, no meio da imersão, fui ver meu pai.</w:t>
       </w:r>
     </w:p>
     <w:p>
@@ -14613,7 +14618,7 @@
     </w:p>
     <w:p>
       <w:r>
-        <w:t xml:space="preserve">Eu cheguei falando. Falei do curso, das coisas que eu ia mudar, do que o Kousuke devia entender, do que o Kousuke não entendia, da sala, do contrato, do travesseiro no sofá. Falei vinte minutos sem parar, enquanto minha mãe mexia a panela e o Marcos mexia o café.</w:t>
+        <w:t xml:space="preserve">Eu cheguei falando. Falei da imersão, das coisas que eu ia mudar, do que o Kousuke devia entender, do que o Kousuke não entendia, da sala, do contrato, do travesseiro no sofá. Falei vinte minutos sem parar, enquanto minha mãe mexia a panela e o Marcos mexia o café.</w:t>
       </w:r>
     </w:p>
     <w:p>
@@ -15520,7 +15525,7 @@
     </w:p>
     <w:p>
       <w:r>
-        <w:t xml:space="preserve">Era o começo de 2026, e eu tinha me inscrito no Mulheres Experience do jeito que eu fazia as coisas grandes da minha vida: de repente, numa noite, sem perguntar a ninguém. Só que dessa vez, antes de pagar, eu tinha mostrado a tela ao Kousuke. Ele leu, olhou para mim e disse "vai". Não "você já decidiu". Vai.</w:t>
+        <w:t xml:space="preserve">Era março de 2026. Eu tinha atravessado o mundo sozinha para estar ali, no Brasil, e tinha me inscrito no Mulheres Experience do jeito que eu fazia as coisas grandes da minha vida: de repente, numa noite, sem perguntar a ninguém. Só que dessa vez, antes de pagar, eu tinha mostrado a tela ao Kousuke. Ele leu, olhou para mim e disse "vai". Não "você já decidiu". Vai.</w:t>
       </w:r>
     </w:p>
     <w:p>
@@ -16145,12 +16150,12 @@
     </w:p>
     <w:p>
       <w:r>
-        <w:t xml:space="preserve">A resposta demorou. Depois chegou.</w:t>
-      </w:r>
-    </w:p>
-    <w:p>
-      <w:r>
-        <w:t xml:space="preserve">"Essa da direita eu conheço desde a maquete de geografia."</w:t>
+        <w:t xml:space="preserve">A resposta demorou. No Japão era madrugada. Depois chegou.</w:t>
+      </w:r>
+    </w:p>
+    <w:p>
+      <w:r>
+        <w:t xml:space="preserve">"Essa da direita eu conheço desde a lista de física."</w:t>
       </w:r>
     </w:p>
     <w:p>
@@ -17055,7 +17060,7 @@
     </w:p>
     <w:p>
       <w:r>
-        <w:t xml:space="preserve">As meninas apareceram depois, de pijama. A Tiemi trouxe um desenho de mim com a franja nos olhos. A Ayumi foi direto para o teclado e tocou o parabéns, errando a mesma nota de sempre e recomeçando. A Mity me entregou um bilhete dobrado em quatro e disse para eu ler depois, sozinha. Eu li depois, sozinha. Não vou contar o que dizia.</w:t>
+        <w:t xml:space="preserve">As meninas apareceram depois, de pijama. A Tiemi trouxe um desenho de mim com a franja nos olhos. A Mity foi direto para o teclado e tocou o parabéns, errando a mesma nota de sempre e recomeçando. A Ayumi me entregou um bilhete dobrado em quatro e disse para eu ler depois, sozinha. Eu li depois, sozinha. Não vou contar o que dizia.</w:t>
       </w:r>
     </w:p>
     <w:p>
@@ -17128,7 +17133,7 @@
         <w:rPr>
           <w:i/>
         </w:rPr>
-        <w:t xml:space="preserve">Mas eu também preciso te contar o resto. Você vai ser amada por um menino de óculos que vai aparecer aí em casa com a desculpa de uma maquete de geografia e nunca mais vai parar de vir. Vai ter três filhas, e cada uma vai te ensinar um jeito diferente de ser mãe. A mamãe vai ajeitar a sua franja com os dedos, deitada numa cama de hospital. O papai vai rir com os ombros vendo você gritar pendurada numa ponte. Você vai gritar. Vai aprender a pedir. Vai aprender a dizer "eu errei". E um dia, numa água fria, vai deixar alguém te segurar.</w:t>
+        <w:t xml:space="preserve">Mas eu também preciso te contar o resto. Você vai ser amada por um menino de óculos, um ano mais novo do que você, que vai aparecer aí em casa com a desculpa de uma lista de física e nunca mais vai parar de vir. Vai ter três filhas, e cada uma vai te ensinar um jeito diferente de ser mãe. A mamãe vai ajeitar a sua franja com os dedos, deitada numa cama de hospital. O papai vai rir com os ombros vendo você gritar pendurada numa ponte. Você vai gritar. Vai aprender a pedir. Vai aprender a dizer "eu errei". E um dia, numa água fria, vai deixar alguém te segurar.</w:t>
       </w:r>
     </w:p>
     <w:p>
@@ -17497,7 +17502,7 @@
     </w:p>
     <w:p>
       <w:r>
-        <w:t xml:space="preserve">A Mity riu por cima do livro que estava lendo na mesa, um livro grosso, de capa azul, que ela não largava nem para comer. Do quarto, vinha o som do teclado: a Ayumi tinha sumido depois do jantar e estava tocando a mesma música de sempre, errando na mesma nota de sempre, voltando do começo, com uma paciência que ninguém na família sabia de onde tinha vindo. Minha mãe dizia que era da avó, a do porta-retratos, que tocava qualquer instrumento que pusessem na mão dela. Talvez fosse.</w:t>
+        <w:t xml:space="preserve">A Mity riu. Estava montando o cubo mágico embaixo da mesa, sem olhar, como quem tricota. Do quarto, vinha a música baixinha do celular e o barulho de pés descalços no chão: a Ayumi tinha sumido depois do jantar e estava ensaiando a coreografia de sempre, errando no mesmo passo de sempre, voltando a música do começo, com uma paciência que ninguém na família sabia de onde tinha vindo.</w:t>
       </w:r>
     </w:p>
     <w:p>
@@ -17512,12 +17517,12 @@
     </w:p>
     <w:p>
       <w:r>
-        <w:t xml:space="preserve">Fui até o quarto. A Ayumi estava sentada no banco do teclado, de costas para a porta, com o cabelo preso num rabo torto e os pés descalços enroscados nas pernas do banco. Não parou de tocar quando eu entrei. Eu não disse nada. Não perguntei da escola, não corrigi a nota, não pedi para ela ir dormir. Sentei na ponta do banco, do lado dela, e fiquei.</w:t>
-      </w:r>
-    </w:p>
-    <w:p>
-      <w:r>
-        <w:t xml:space="preserve">Ela errou a nota de novo. Olhou para mim de lado, esperando alguma coisa. Eu continuei quieta. Ela voltou do começo e, dessa vez, tocou a música inteira sem errar, com o ombro encostado no meu braço. Quando terminou, ficou com as mãos paradas em cima das teclas.</w:t>
+        <w:t xml:space="preserve">Fui até o quarto. A Ayumi estava de pé na frente do espelho do armário, de costas para a porta, com o cabelo preso num rabo torto e os pés descalços. Não parou quando eu entrei. Eu não disse nada. Não perguntei da escola, não corrigi o passo, não pedi para ela ir dormir. Sentei na ponta da cama, atrás dela, e fiquei.</w:t>
+      </w:r>
+    </w:p>
+    <w:p>
+      <w:r>
+        <w:t xml:space="preserve">Ela errou o passo de novo. Olhou para mim pelo espelho, esperando alguma coisa. Eu continuei quieta. Ela voltou a música do começo e, dessa vez, dançou a coreografia inteira sem errar, olhando para mim pelo espelho o tempo todo. Quando terminou, ficou parada, respirando rápido, com os braços ainda no ar. Depois sentou do meu lado, na cama, com o ombro encostado no meu braço.</w:t>
       </w:r>
     </w:p>
     <w:p>
@@ -17551,7 +17556,7 @@
     </w:p>
     <w:p>
       <w:r>
-        <w:t xml:space="preserve">A Mity levantou os olhos do livro.</w:t>
+        <w:t xml:space="preserve">A Mity parou o cubo no meio.</w:t>
       </w:r>
     </w:p>
     <w:p>
@@ -17576,7 +17581,7 @@
     </w:p>
     <w:p>
       <w:r>
-        <w:t xml:space="preserve">E contei, enquanto procurava o jeito certo de segurar a tigela: a tesoura de destrinchar frango, o vestido bufante da costureira da rua de trás, o meu pai rindo com os ombros na porta da cozinha. A Mity fechou o livro com o dedo marcando a página, para ouvir. Encaixei a tigela na cabeça da Tiemi, que desapareceu da testa para cima e começou a rir por baixo dela, um riso abafado de dentro de uma panela.</w:t>
+        <w:t xml:space="preserve">E contei, enquanto procurava o jeito certo de segurar a tigela: a tesoura de destrinchar frango, o vestido bufante da costureira da rua de trás, o meu pai rindo com os ombros na porta da cozinha. A Mity pôs o cubo na mesa, pela metade, para ouvir. Encaixei a tigela na cabeça da Tiemi, que desapareceu da testa para cima e começou a rir por baixo dela, um riso abafado de dentro de uma panela.</w:t>
       </w:r>
     </w:p>
     <w:p>
@@ -17596,7 +17601,7 @@
     </w:p>
     <w:p>
       <w:r>
-        <w:t xml:space="preserve">Cortei devagar, rente à borda, ouvindo o barulho do corte bem em cima da testa dela, um barulho de papel molhado, e os fios pretos caindo na toalha, no chão, no nariz dela, que ela franzia. O Kousuke fechou a torneira e ficou olhando da pia, com um pano de prato no ombro. No quarto, a Ayumi errou a nota de novo e recomeçou.</w:t>
+        <w:t xml:space="preserve">Cortei devagar, rente à borda, ouvindo o barulho do corte bem em cima da testa dela, um barulho de papel molhado, e os fios pretos caindo na toalha, no chão, no nariz dela, que ela franzia. O Kousuke fechou a torneira e ficou olhando da pia, com um pano de prato no ombro. No quarto, a música da Ayumi voltou do começo.</w:t>
       </w:r>
     </w:p>
     <w:p>
@@ -17606,7 +17611,7 @@
     </w:p>
     <w:p>
       <w:r>
-        <w:t xml:space="preserve">Houve um silêncio. A Mity pôs o livro na mesa, aberto, de cabeça para baixo. O Kousuke pôs a mão na boca. A Tiemi, sem saber de nada, olhou para as irmãs, depois para o pai, depois para mim, e apalpou a testa com a ponta dos dedos, procurando a franja onde ela devia estar.</w:t>
+        <w:t xml:space="preserve">Houve um silêncio. A Mity deixou o cubo cair no chão e não foi pegar. O Kousuke pôs a mão na boca. A Tiemi, sem saber de nada, olhou para as irmãs, depois para o pai, depois para mim, e apalpou a testa com a ponta dos dedos, procurando a franja onde ela devia estar.</w:t>
       </w:r>
     </w:p>
     <w:p>

</xml_diff>

<commit_message>
A Menina Elefante: terceira rodada de correções da família
- 'mamãe Juju' (cap. 25); namoro com ela aos 16 e ele aos 15 (cap. 10).
- Jacareí e o Bunkyo/kaikan; o Kousuke presidente do grupo de jovens
  (caps. 5, 10, 12).
- Batismo no Brasil depois da imersão do Pablo Marçal, nov. 2025
  (caps. 29, 30); Paris na volta do Mulheres Experience (cap. 31).

Co-Authored-By: Claude Opus 5.5 <noreply@anthropic.com>
Claude-Session: https://claude.ai/code/session_011ZTeK22H8KBNtWenzEUTZE
</commit_message>
<xml_diff>
--- a/menina_elefante/saidas/A_Menina_Elefante_V3.docx
+++ b/menina_elefante/saidas/A_Menina_Elefante_V3.docx
@@ -2434,7 +2434,7 @@
     </w:p>
     <w:p>
       <w:r>
-        <w:t xml:space="preserve">Nas terças e quintas, quem aparecia lá em casa era o Kousuke. Era um ano mais novo do que eu, filho de uma família que a minha mãe conhecia da associação, e sabia matemática e física como quem sabe o caminho de casa. Desde o começo do ano, tocava a campainha com uma desculpa diferente: a lista de física, a prova de trigonometria, uma apostila que ele jurava que eu ia precisar. Sentava na mesa da cozinha, abria o caderno e ficava. Minha mãe deixava a porta da sala aberta e passava por ali mais vezes do que precisava.</w:t>
+        <w:t xml:space="preserve">Nas terças e quintas, quem aparecia lá em casa era o Kousuke. Era um ano mais novo do que eu, filho de uma família que a minha mãe conhecia do Bunkyo, a associação japonesa de Jacareí, que todo mundo chamava de kaikan, e sabia matemática e física como quem sabe o caminho de casa. Desde o começo do ano, tocava a campainha com uma desculpa diferente: a lista de física, a prova de trigonometria, uma apostila que ele jurava que eu ia precisar. Sentava na mesa da cozinha, abria o caderno e ficava. Minha mãe deixava a porta da sala aberta e passava por ali mais vezes do que precisava.</w:t>
       </w:r>
     </w:p>
     <w:p>
@@ -4911,12 +4911,12 @@
     </w:p>
     <w:p>
       <w:r>
-        <w:t xml:space="preserve">Eu conhecia o Kousuke do jeito que todo descendente conhecia todo descendente naquela cidade: de festa da associação, de ser apresentado três vezes à mesma pessoa por três tias diferentes. Ele usava óculos de armação preta e falava de um jeito complicado demais para a idade dele. Uma vez, no meio de um exercício de matemática, me explicou por que o preço do arroz tinha subido, com câmbio e importação, e eu fiquei olhando para ele sem entender como alguém conseguia pensar tanto sobre arroz.</w:t>
-      </w:r>
-    </w:p>
-    <w:p>
-      <w:r>
-        <w:t xml:space="preserve">Aos quinze anos, a gente começou a namorar, se é que aquilo era namoro. Durava três semanas, e eu terminava por causa de uma bobagem. Ele sumia uns dias e voltava com uma lista de física. Depois do infarto do meu pai, terminei dizendo que não tinha cabeça para nada, o que era verdade, e ele continuou vindo, e passou a carregar as sacolas da farmácia sem que ninguém pedisse. Voltamos. Terminamos. Voltamos.</w:t>
+        <w:t xml:space="preserve">Eu conhecia o Kousuke do jeito que todo descendente conhecia todo descendente naquela cidade: de festa do kaikan, de ser apresentado três vezes à mesma pessoa por três tias diferentes. Ele usava óculos de armação preta, presidia o grupo de jovens do kaikan com uma prancheta na mão e falava de um jeito complicado demais para a idade dele. Uma vez, no meio de um exercício de matemática, me explicou por que o preço do arroz tinha subido, com câmbio e importação, e eu fiquei olhando para ele sem entender como alguém conseguia pensar tanto sobre arroz.</w:t>
+      </w:r>
+    </w:p>
+    <w:p>
+      <w:r>
+        <w:t xml:space="preserve">Depois do infarto do meu pai, ele continuou vindo, e passou a carregar as sacolas da farmácia sem que ninguém pedisse. Eu tinha dezesseis anos, e ele quinze, quando a gente começou a namorar, se é que aquilo era namoro. Durava três semanas, e eu terminava por causa de uma bobagem, ou porque não tinha cabeça para nada, o que era verdade. Ele sumia uns dias e voltava com uma lista de física. Voltamos. Terminamos. Voltamos.</w:t>
       </w:r>
     </w:p>
     <w:p>
@@ -6038,7 +6038,7 @@
     </w:p>
     <w:p>
       <w:r>
-        <w:t xml:space="preserve">Era a festa de setenta e três anos dela, num salão da associação, com a família inteira vindo de outras cidades. No dia, meu pai não atendeu o telefone de manhã, nem à tarde, e eu passei o dia inteiro na ótica olhando para o celular. Às seis, liguei para o Kousuke e disse que não ia.</w:t>
+        <w:t xml:space="preserve">Era a festa de setenta e três anos dela, no salão do kaikan, com a família inteira vindo de outras cidades. No dia, meu pai não atendeu o telefone de manhã, nem à tarde, e eu passei o dia inteiro na ótica olhando para o celular. Às seis, liguei para o Kousuke e disse que não ia.</w:t>
       </w:r>
     </w:p>
     <w:p>
@@ -12389,7 +12389,7 @@
     </w:p>
     <w:p>
       <w:r>
-        <w:t xml:space="preserve">Eu tinha virado uma coisa que eu não sabia nomear. Uma mulher que acordava com o celular, que almoçava com o celular, que dormia com o celular embaixo do travesseiro, vibrando. Uma mãe que tratava as três filhas com a mesma fórmula, a mesma caixinha, o mesmo tom, a mesma pressa, porque não tinha tempo de descobrir o que cada uma precisava. A Ayumi, com nove anos, respondia com monossílabos e fechava a porta do quarto. A Mity chorava por coisas que eu achava pequenas. A Tiemi, ainda bebê, quando caía, corria chorando para a Ayumi, chamando "Juju", o apelido que tinha inventado para a irmã, e não para mim, e eu ri na hora e chorei no carro.</w:t>
+        <w:t xml:space="preserve">Eu tinha virado uma coisa que eu não sabia nomear. Uma mulher que acordava com o celular, que almoçava com o celular, que dormia com o celular embaixo do travesseiro, vibrando. Uma mãe que tratava as três filhas com a mesma fórmula, a mesma caixinha, o mesmo tom, a mesma pressa, porque não tinha tempo de descobrir o que cada uma precisava. A Ayumi, com nove anos, respondia com monossílabos e fechava a porta do quarto. A Mity chorava por coisas que eu achava pequenas. A Tiemi, ainda bebê, quando caía, corria chorando para a Ayumi, chamando "mamãe Juju", o nome que tinha inventado para a irmã, e não para mim, e eu ri na hora e chorei no carro.</w:t>
       </w:r>
     </w:p>
     <w:p>
@@ -14378,7 +14378,7 @@
     </w:p>
     <w:p>
       <w:r>
-        <w:t xml:space="preserve">Nas semanas seguintes, a gente continuou trabalhando junto. Continuou respondendo cliente, levando as meninas na escola, jantando na mesma mesa. Mas falava só o necessário, pelo celular, mesmo estando na mesma casa. Em novembro, eu comprei uma passagem para o Brasil, para mais uma imersão, e para ficar um mês. Contei a ele depois de comprar. Ele disse "tudo bem", com a mesma voz com que tinha dito "tudo bem" no tempo do "então escolhe". Uma amiga da igreja, a Lê, ficou com as meninas.</w:t>
+        <w:t xml:space="preserve">Nas semanas seguintes, a gente continuou trabalhando junto. Continuou respondendo cliente, levando as meninas na escola, jantando na mesma mesa. Mas falava só o necessário, pelo celular, mesmo estando na mesma casa. Em novembro, eu comprei uma passagem para o Brasil, para a imersão do Pablo Marçal, e para ficar um mês. Contei a ele depois de comprar. Ele disse "tudo bem", com a mesma voz com que tinha dito "tudo bem" no tempo do "então escolhe". Uma amiga da igreja, a Lê, ficou com as meninas.</w:t>
       </w:r>
     </w:p>
     <w:p>
@@ -15152,7 +15152,7 @@
           <w:sz w:val="19"/>
           <w:szCs w:val="19"/>
         </w:rPr>
-        <w:t xml:space="preserve">CAPÍTULO 30 · 2025–2026</w:t>
+        <w:t xml:space="preserve">CAPÍTULO 30 · 2025</w:t>
       </w:r>
     </w:p>
     <w:p>
@@ -15256,6 +15256,11 @@
       <w:pPr>
         <w:ind w:firstLine="0"/>
       </w:pPr>
+      <w:r>
+        <w:t xml:space="preserve">Antes de voltar daquela viagem, dias depois do fim da imersão, eu tinha sido batizada.</w:t>
+      </w:r>
+    </w:p>
+    <w:p>
       <w:r>
         <w:t xml:space="preserve">Para o batismo, eu escolhi a roupa sozinha.</w:t>
       </w:r>
@@ -16174,7 +16179,7 @@
         <w:ind w:firstLine="0"/>
       </w:pPr>
       <w:r>
-        <w:t xml:space="preserve">Semanas depois, voltei a Paris.</w:t>
+        <w:t xml:space="preserve">Na volta para o Japão, parei em Paris.</w:t>
       </w:r>
     </w:p>
     <w:p>

</xml_diff>

<commit_message>
A Menina Elefante: cap. 29 sem a sala alugada
A Luciana não alugou a sala: o Kousuke acha na impressora o organograma
da empresa que ela queria montar (times de marketing e comercial,
salários, a sala que ela foi ver), feito sem contar a ele. Cap. 28 e
documentos ajustados.

Co-Authored-By: Claude Opus 5.5 <noreply@anthropic.com>
Claude-Session: https://claude.ai/code/session_011ZTeK22H8KBNtWenzEUTZE
</commit_message>
<xml_diff>
--- a/menina_elefante/saidas/A_Menina_Elefante_V3.docx
+++ b/menina_elefante/saidas/A_Menina_Elefante_V3.docx
@@ -13780,7 +13780,7 @@
     </w:p>
     <w:p>
       <w:r>
-        <w:t xml:space="preserve">No carro, a caminho, ele dirigiu calado. A Tiemi dormia na cadeirinha, de boca aberta, com o gorro rosa caído sobre um olho. Eu passei a primeira hora respondendo mensagens de clientes e a segunda falando sobre uma ideia nova, uma empresa só minha, que eu queria abrir naquele ano. Falei de nome, de logotipo, de sala comercial. Ele ouvia, com as duas mãos no volante, olhando a estrada.</w:t>
+        <w:t xml:space="preserve">No carro, a caminho, ele dirigiu calado. A Tiemi dormia na cadeirinha, de boca aberta, com o gorro rosa caído sobre um olho. Eu passei a primeira hora respondendo mensagens de clientes e a segunda falando sobre uma ideia nova, uma empresa só minha, que eu queria abrir naquele ano. Falei de nome, de logotipo, de um time de marketing, de um time comercial, de uma sala perto da estação. Ele ouvia, com as duas mãos no volante, olhando a estrada.</w:t>
       </w:r>
     </w:p>
     <w:p>
@@ -14279,12 +14279,12 @@
     </w:p>
     <w:p>
       <w:r>
-        <w:t xml:space="preserve">Em outubro, eu assinei o contrato de aluguel de uma sala comercial para essa empresa. Uma sala pequena, clara, no segundo andar de um prédio perto da estação. Assinei numa terça-feira, com o carimbo que eu tinha finalmente aprendido a usar, e deixei a cópia do contrato no porta-luvas do carro, porque ia contar ao Kousuke no fim de semana, quando tivesse tempo.</w:t>
-      </w:r>
-    </w:p>
-    <w:p>
-      <w:r>
-        <w:t xml:space="preserve">Ele achou o contrato na quinta, procurando o recibo do pedágio.</w:t>
+        <w:t xml:space="preserve">Em outubro, eu já tinha a empresa inteira desenhada numa folha. Um organograma feito no computador, com quadradinhos e setas: o meu nome em cima e, embaixo, um time de marketing e um time comercial, cada um com as suas vagas, os salários numa coluna ao lado e, no rodapé, o preço de uma sala pequena e clara perto da estação, que eu tinha ido ver "só para ter uma ideia". Ainda não tinha contratado ninguém. Ainda não tinha alugado nada. Mas, na minha cabeça, já estava tudo pronto, e eu ia contar ao Kousuke no fim de semana, quando tivesse tempo.</w:t>
+      </w:r>
+    </w:p>
+    <w:p>
+      <w:r>
+        <w:t xml:space="preserve">Ele achou a folha na quinta, na bandeja da impressora, procurando a declaração de um cliente.</w:t>
       </w:r>
     </w:p>
     <w:p>
@@ -14303,7 +14303,7 @@
         <w:ind w:firstLine="0"/>
       </w:pPr>
       <w:r>
-        <w:t xml:space="preserve">Eu estava na cozinha quando ele entrou com o papel na mão. As meninas dormiam. A louça do jantar estava na pia, esperando. Ele pôs o contrato em cima da mesa, alisou a dobra com a palma da mão, e ficou de pé, olhando para ele.</w:t>
+        <w:t xml:space="preserve">Eu estava na cozinha quando ele entrou com a folha na mão. As meninas dormiam. A louça do jantar estava na pia, esperando. Ele pôs a folha em cima da mesa, alisou a dobra com a palma da mão, e ficou de pé, olhando para ele.</w:t>
       </w:r>
     </w:p>
     <w:p>
@@ -14318,7 +14318,7 @@
     </w:p>
     <w:p>
       <w:r>
-        <w:t xml:space="preserve">— Você assinou na terça.</w:t>
+        <w:t xml:space="preserve">— A data aqui é de terça.</w:t>
       </w:r>
     </w:p>
     <w:p>
@@ -14333,12 +14333,12 @@
     </w:p>
     <w:p>
       <w:r>
-        <w:t xml:space="preserve">Eu comecei a explicar. Tinha a explicação pronta, como sempre: o preço bom, a localização, o prazo curto, a oportunidade que não ia esperar, a planilha que eu mesma tinha feito e que fechava. Falei sem parar, com a voz subindo, do jeito que eu falava no tempo do recado de estatística. Ele deixou eu falar. Sempre deixava.</w:t>
-      </w:r>
-    </w:p>
-    <w:p>
-      <w:r>
-        <w:t xml:space="preserve">Quando eu parei, ele não respondeu nada sobre a sala.</w:t>
+        <w:t xml:space="preserve">Eu comecei a explicar. Tinha a explicação pronta, como sempre: o mercado crescendo, as pessoas certas para cada vaga, a oportunidade que não ia esperar, a planilha que eu mesma tinha feito e que fechava. Falei sem parar, com a voz subindo, do jeito que eu falava no tempo do recado de estatística. Ele deixou eu falar. Sempre deixava.</w:t>
+      </w:r>
+    </w:p>
+    <w:p>
+      <w:r>
+        <w:t xml:space="preserve">Quando eu parei, ele não respondeu nada sobre a empresa.</w:t>
       </w:r>
     </w:p>
     <w:p>
@@ -14363,7 +14363,7 @@
     </w:p>
     <w:p>
       <w:r>
-        <w:t xml:space="preserve">— Eu cansei, Lu. — Ele pôs as duas mãos na mesa, dos dois lados do contrato. — Eu cansei de andar atrás. Eu queria andar do lado. Você não deixa. Você nunca deixou ninguém fazer nada por você. Nem eu.</w:t>
+        <w:t xml:space="preserve">— Eu cansei, Lu. — Ele pôs as duas mãos na mesa, dos dois lados da folha. — Eu cansei de andar atrás. Eu queria andar do lado. Você não deixa. Você nunca deixou ninguém fazer nada por você. Nem eu.</w:t>
       </w:r>
     </w:p>
     <w:p>
@@ -14618,7 +14618,7 @@
     </w:p>
     <w:p>
       <w:r>
-        <w:t xml:space="preserve">Eu cheguei falando. Falei da imersão, das coisas que eu ia mudar, do que o Kousuke devia entender, do que o Kousuke não entendia, da sala, do contrato, do travesseiro no sofá. Falei vinte minutos sem parar, enquanto minha mãe mexia a panela e o Marcos mexia o café.</w:t>
+        <w:t xml:space="preserve">Eu cheguei falando. Falei da imersão, das coisas que eu ia mudar, do que o Kousuke devia entender, do que o Kousuke não entendia, da empresa, do organograma, do travesseiro no sofá. Falei vinte minutos sem parar, enquanto minha mãe mexia a panela e o Marcos mexia o café.</w:t>
       </w:r>
     </w:p>
     <w:p>

</xml_diff>

<commit_message>
A Menina Elefante: cap. 29 sem organograma
Ela não faz plano no papel: já tinha conversado com todas as pessoas
que queria chamar. O Kousuke sabe por um dos rapazes, que pergunta se
deve pedir demissão. Cap. 28 e decisões ajustados.

Co-Authored-By: Claude Opus 5.5 <noreply@anthropic.com>
Claude-Session: https://claude.ai/code/session_011ZTeK22H8KBNtWenzEUTZE
</commit_message>
<xml_diff>
--- a/menina_elefante/saidas/A_Menina_Elefante_V3.docx
+++ b/menina_elefante/saidas/A_Menina_Elefante_V3.docx
@@ -13780,7 +13780,7 @@
     </w:p>
     <w:p>
       <w:r>
-        <w:t xml:space="preserve">No carro, a caminho, ele dirigiu calado. A Tiemi dormia na cadeirinha, de boca aberta, com o gorro rosa caído sobre um olho. Eu passei a primeira hora respondendo mensagens de clientes e a segunda falando sobre uma ideia nova, uma empresa só minha, que eu queria abrir naquele ano. Falei de nome, de logotipo, de um time de marketing, de um time comercial, de uma sala perto da estação. Ele ouvia, com as duas mãos no volante, olhando a estrada.</w:t>
+        <w:t xml:space="preserve">No carro, a caminho, ele dirigiu calado. A Tiemi dormia na cadeirinha, de boca aberta, com o gorro rosa caído sobre um olho. Eu passei a primeira hora respondendo mensagens de clientes e a segunda falando sobre uma ideia nova, uma empresa só minha, que eu queria abrir naquele ano. Falei de nome, de logotipo, das pessoas que eu queria chamar para o marketing e para o comercial. Ele ouvia, com as duas mãos no volante, olhando a estrada.</w:t>
       </w:r>
     </w:p>
     <w:p>
@@ -14279,12 +14279,12 @@
     </w:p>
     <w:p>
       <w:r>
-        <w:t xml:space="preserve">Em outubro, eu já tinha a empresa inteira desenhada numa folha. Um organograma feito no computador, com quadradinhos e setas: o meu nome em cima e, embaixo, um time de marketing e um time comercial, cada um com as suas vagas, os salários numa coluna ao lado e, no rodapé, o preço de uma sala pequena e clara perto da estação, que eu tinha ido ver "só para ter uma ideia". Ainda não tinha contratado ninguém. Ainda não tinha alugado nada. Mas, na minha cabeça, já estava tudo pronto, e eu ia contar ao Kousuke no fim de semana, quando tivesse tempo.</w:t>
-      </w:r>
-    </w:p>
-    <w:p>
-      <w:r>
-        <w:t xml:space="preserve">Ele achou a folha na quinta, na bandeja da impressora, procurando a declaração de um cliente.</w:t>
+        <w:t xml:space="preserve">Eu não fiz plano no papel. Nunca fui de fazer. Em outubro, eu já tinha conversado com todo mundo: com a moça que ia cuidar do marketing, com os dois rapazes que iam formar o time comercial, com uma cliente antiga que eu queria trazer para o atendimento. Cada conversa num café diferente, cada uma com a mesma certeza. Eu ainda não tinha contratado ninguém nem alugado sala nenhuma, mas na minha cabeça a empresa já existia, com as pessoas sentadas nos seus lugares. Ia contar ao Kousuke no fim de semana, quando tivesse tempo.</w:t>
+      </w:r>
+    </w:p>
+    <w:p>
+      <w:r>
+        <w:t xml:space="preserve">Ele soube na quinta, por um dos rapazes, que mandou uma mensagem perguntando se devia mesmo pedir demissão do emprego.</w:t>
       </w:r>
     </w:p>
     <w:p>
@@ -14303,7 +14303,7 @@
         <w:ind w:firstLine="0"/>
       </w:pPr>
       <w:r>
-        <w:t xml:space="preserve">Eu estava na cozinha quando ele entrou com a folha na mão. As meninas dormiam. A louça do jantar estava na pia, esperando. Ele pôs a folha em cima da mesa, alisou a dobra com a palma da mão, e ficou de pé, olhando para ele.</w:t>
+        <w:t xml:space="preserve">Eu estava na cozinha quando ele entrou com o celular na mão. As meninas dormiam. A louça do jantar estava na pia, esperando. Ele pôs o celular em cima da mesa, com a mensagem aberta, virado para mim, e ficou de pé, olhando para a tela.</w:t>
       </w:r>
     </w:p>
     <w:p>
@@ -14318,7 +14318,7 @@
     </w:p>
     <w:p>
       <w:r>
-        <w:t xml:space="preserve">— A data aqui é de terça.</w:t>
+        <w:t xml:space="preserve">— Ele disse que você conversou com ele na terça. E com os outros antes.</w:t>
       </w:r>
     </w:p>
     <w:p>
@@ -14363,7 +14363,7 @@
     </w:p>
     <w:p>
       <w:r>
-        <w:t xml:space="preserve">— Eu cansei, Lu. — Ele pôs as duas mãos na mesa, dos dois lados da folha. — Eu cansei de andar atrás. Eu queria andar do lado. Você não deixa. Você nunca deixou ninguém fazer nada por você. Nem eu.</w:t>
+        <w:t xml:space="preserve">— Eu cansei, Lu. — Ele pôs as duas mãos na mesa, dos dois lados do celular. — Eu cansei de andar atrás. Eu queria andar do lado. Você não deixa. Você nunca deixou ninguém fazer nada por você. Nem eu.</w:t>
       </w:r>
     </w:p>
     <w:p>
@@ -14618,7 +14618,7 @@
     </w:p>
     <w:p>
       <w:r>
-        <w:t xml:space="preserve">Eu cheguei falando. Falei da imersão, das coisas que eu ia mudar, do que o Kousuke devia entender, do que o Kousuke não entendia, da empresa, do organograma, do travesseiro no sofá. Falei vinte minutos sem parar, enquanto minha mãe mexia a panela e o Marcos mexia o café.</w:t>
+        <w:t xml:space="preserve">Eu cheguei falando. Falei da imersão, das coisas que eu ia mudar, do que o Kousuke devia entender, do que o Kousuke não entendia, da empresa, das pessoas que eu já tinha chamado, do travesseiro no sofá. Falei vinte minutos sem parar, enquanto minha mãe mexia a panela e o Marcos mexia o café.</w:t>
       </w:r>
     </w:p>
     <w:p>

</xml_diff>

<commit_message>
A Menina Elefante: as brigas do casal no auge (cap. 25) e sobra da ótica (cap. 12)
- Cap. 25: brigas um dia sim, outro não; a voz trocada para o cliente no
  meio da briga; a visita em Minokamo fingindo que está tudo bem; à noite,
  as meninas mandadas para cima e a Ayumi com o fone desligado.
- Cap. 26: 'briga de vez em quando, como todo casal'.
- Cap. 12: tirado 'o outro lado do balcão', resto do encontro na ótica.

Co-Authored-By: Claude Opus 5.5 <noreply@anthropic.com>
Claude-Session: https://claude.ai/code/session_011ZTeK22H8KBNtWenzEUTZE
</commit_message>
<xml_diff>
--- a/menina_elefante/saidas/A_Menina_Elefante_V3.docx
+++ b/menina_elefante/saidas/A_Menina_Elefante_V3.docx
@@ -6014,7 +6014,7 @@
     </w:p>
     <w:p>
       <w:r>
-        <w:t xml:space="preserve">Porque ele ia embora. Disso eu tinha certeza. Era só uma questão de tempo. Uma hora ele ia olhar direito e ver o que tinha do outro lado do balcão: uma menina que não sabia dizer o que sentia, que não tinha amigos, que passava as noites cozinhando para um pai que não comia, que chegava aos encontros com cheiro de ônibus e de alho frito. Uma hora ele ia enxergar. E eu preferia que fosse logo, para não ter de esperar.</w:t>
+        <w:t xml:space="preserve">Porque ele ia embora. Disso eu tinha certeza. Era só uma questão de tempo. Uma hora ele ia olhar direito e ver o que tinha do outro lado da mesa da cozinha, atrás das listas de física: uma menina que não sabia dizer o que sentia, que não tinha amigos, que passava as noites cozinhando para um pai que não comia, que chegava aos encontros com cheiro de ônibus e de alho frito. Uma hora ele ia enxergar. E eu preferia que fosse logo, para não ter de esperar.</w:t>
       </w:r>
     </w:p>
     <w:p>
@@ -6207,7 +6207,7 @@
           <w:sz w:val="22"/>
           <w:szCs w:val="22"/>
         </w:rPr>
-        <w:t xml:space="preserve">Não era maldade. Era medo. Eu tinha certeza de que ele ia embora, porque, na minha cabeça, quem enxergasse direito o outro lado do balcão ia embora. Então eu apressava o fim, para não ter de esperar por ele. "Então escolhe" foi a frase mais cruel que eu disse naqueles anos, e eu a disse a quem nunca tinha me feito escolher nada.</w:t>
+        <w:t xml:space="preserve">Não era maldade. Era medo. Eu tinha certeza de que ele ia embora, porque, na minha cabeça, quem me enxergasse direito ia embora. Então eu apressava o fim, para não ter de esperar por ele. "Então escolhe" foi a frase mais cruel que eu disse naqueles anos, e eu a disse a quem nunca tinha me feito escolher nada.</w:t>
       </w:r>
     </w:p>
     <w:p>
@@ -12408,6 +12408,70 @@
         <w:ind w:firstLine="0"/>
       </w:pPr>
       <w:r>
+        <w:t xml:space="preserve">A gente começou a brigar um dia sim e outro não.</w:t>
+      </w:r>
+    </w:p>
+    <w:p>
+      <w:r>
+        <w:t xml:space="preserve">No começo, não eram brigas grandes. Eram por horário, por cliente, por quem tinha esquecido de mandar o documento para o banco, por quem tinha marcado duas visitas no mesmo sábado. Depois ficaram do tamanho de tudo. Eu dizia que ele era lento. Ele dizia que eu atropelava. Eu dizia que, se eu não fizesse, ninguém fazia. Ele parava de responder no meio da frase, e o silêncio dele me dava mais raiva do que qualquer coisa que ele pudesse dizer.</w:t>
+      </w:r>
+    </w:p>
+    <w:p>
+      <w:r>
+        <w:t xml:space="preserve">E, no meio da briga, o celular tocava.</w:t>
+      </w:r>
+    </w:p>
+    <w:p>
+      <w:r>
+        <w:t xml:space="preserve">Eu atendia com outra voz. "Oi, tudo bem? Pode falar, claro." Ele, do outro lado da mesa, abria o notebook e respondia a outro cliente com uma carinha sorrindo no fim da mensagem. Numa tarde, a gente estava no meio de uma discussão dentro do carro, parado na frente da casa de uma família de Minokamo, quando a mãe abriu a porta e acenou. Nós dois descemos sorrindo. Ele carregou a pasta. Eu elogiei a cortina. Passamos uma hora sentados lado a lado no sofá deles, explicando o financiamento, passando os papéis um para o outro com cuidado, terminando as frases um do outro, como um casal de comercial de margarina. Quando a porta fechou atrás de nós, a gente entrou no carro e continuou a briga na mesma palavra em que tinha parado.</w:t>
+      </w:r>
+    </w:p>
+    <w:p>
+      <w:r>
+        <w:t xml:space="preserve">À noite era pior, porque à noite não tinha cliente para interromper.</w:t>
+      </w:r>
+    </w:p>
+    <w:p>
+      <w:r>
+        <w:t xml:space="preserve">— Meninas, para cima. Vai escovar o dente.</w:t>
+      </w:r>
+    </w:p>
+    <w:p>
+      <w:r>
+        <w:t xml:space="preserve">— Mas ainda é cedo.</w:t>
+      </w:r>
+    </w:p>
+    <w:p>
+      <w:r>
+        <w:t xml:space="preserve">— Para cima.</w:t>
+      </w:r>
+    </w:p>
+    <w:p>
+      <w:r>
+        <w:t xml:space="preserve">Elas subiam. Eu esperava a porta do quarto delas fechar, lá em cima, e só então começava, em voz baixa, uma voz que ia subindo devagar sem que eu percebesse. O Kousuke falava ainda mais baixo, que era o jeito dele de gritar. A gente achava que a escada e a porta fechada davam conta. Que criança dorme rápido. Que elas não entendiam.</w:t>
+      </w:r>
+    </w:p>
+    <w:p>
+      <w:r>
+        <w:t xml:space="preserve">Numa dessas noites, depois que ele foi para o sofá, eu subi para ver se elas estavam cobertas. A Tiemi dormia de bruços no berço. A Mity estava virada para a parede, de olhos fechados demais. E a Ayumi estava sentada na cama, no escuro, com o cobertor puxado até o queixo e o fone de ouvido nas orelhas, com o fio solto em cima do cobertor, sem estar ligado em nada.</w:t>
+      </w:r>
+    </w:p>
+    <w:p>
+      <w:pPr>
+        <w:keepNext/>
+        <w:spacing w:before="200" w:after="200"/>
+        <w:ind w:firstLine="0"/>
+        <w:jc w:val="center"/>
+      </w:pPr>
+      <w:r>
+        <w:t xml:space="preserve">*   *   *</w:t>
+      </w:r>
+    </w:p>
+    <w:p>
+      <w:pPr>
+        <w:ind w:firstLine="0"/>
+      </w:pPr>
+      <w:r>
         <w:t xml:space="preserve">Em setembro, eu fui pular de novo.</w:t>
       </w:r>
     </w:p>
@@ -12596,7 +12660,7 @@
           <w:sz w:val="22"/>
           <w:szCs w:val="22"/>
         </w:rPr>
-        <w:t xml:space="preserve">A Ayumi não disse nada, parada no batente. Não precisou. Os filhos quase nunca pedem com palavras. Eles ficam na porta, esperando que a gente levante os olhos da tela.</w:t>
+        <w:t xml:space="preserve">As crianças escutam. Escutam a briga atrás da porta fechada, e escutam também o sorriso que a gente monta para o cliente cinco minutos depois. A Ayumi não disse nada, parada no batente. Não precisou. Os filhos quase nunca pedem com palavras. Eles ficam na porta, esperando que a gente levante os olhos da tela.</w:t>
       </w:r>
     </w:p>
     <w:p>
@@ -12738,7 +12802,7 @@
     </w:p>
     <w:p>
       <w:r>
-        <w:t xml:space="preserve">Eu tinha me preparado. Durante o dia, entre uma ligação de cliente e a saída da escola, tinha feito mentalmente a lista do que contar, na ordem certa, como quem prepara a apresentação de uma casa. Idade, casada, três filhas, Japão desde quando, trabalho com o meu marido no mercado imobiliário, a gente atende brasileiros que querem comprar casa aqui. Falei tudo em uns quatro minutos. Ela não anotou nada.</w:t>
+        <w:t xml:space="preserve">Eu tinha me preparado. Durante o dia, entre uma ligação de cliente e a saída da escola, tinha feito mentalmente a lista do que contar, na ordem certa, como quem prepara a apresentação de uma casa. Idade, casada, três filhas, Japão desde quando, trabalho com o meu marido no mercado imobiliário, a gente atende brasileiros que querem comprar casa aqui, briga de vez em quando, como todo casal. Falei tudo em uns quatro minutos. Ela não anotou nada.</w:t>
       </w:r>
     </w:p>
     <w:p>

</xml_diff>